<commit_message>
Pipeline 2 Implementation Details
</commit_message>
<xml_diff>
--- a/Docs/Architecture Design and Pipeline Evaluation.docx
+++ b/Docs/Architecture Design and Pipeline Evaluation.docx
@@ -195,43 +195,7 @@
           <w:sz w:val="28"/>
           <w:szCs w:val="28"/>
         </w:rPr>
-        <w:t xml:space="preserve">AI Tier (Hugging Face): We use a lightweight model like </w:t>
-      </w:r>
-      <w:proofErr w:type="spellStart"/>
-      <w:r>
-        <w:rPr>
-          <w:rFonts w:ascii="Times New Roman" w:hAnsi="Times New Roman" w:cs="Times New Roman"/>
-          <w:sz w:val="28"/>
-          <w:szCs w:val="28"/>
-        </w:rPr>
-        <w:t>arnabdhar</w:t>
-      </w:r>
-      <w:proofErr w:type="spellEnd"/>
-      <w:r>
-        <w:rPr>
-          <w:rFonts w:ascii="Times New Roman" w:hAnsi="Times New Roman" w:cs="Times New Roman"/>
-          <w:sz w:val="28"/>
-          <w:szCs w:val="28"/>
-        </w:rPr>
-        <w:t xml:space="preserve">/YOLOv8-Face-Detection or </w:t>
-      </w:r>
-      <w:proofErr w:type="spellStart"/>
-      <w:r>
-        <w:rPr>
-          <w:rFonts w:ascii="Times New Roman" w:hAnsi="Times New Roman" w:cs="Times New Roman"/>
-          <w:sz w:val="28"/>
-          <w:szCs w:val="28"/>
-        </w:rPr>
-        <w:t>mediapipe</w:t>
-      </w:r>
-      <w:proofErr w:type="spellEnd"/>
-      <w:r>
-        <w:rPr>
-          <w:rFonts w:ascii="Times New Roman" w:hAnsi="Times New Roman" w:cs="Times New Roman"/>
-          <w:sz w:val="28"/>
-          <w:szCs w:val="28"/>
-        </w:rPr>
-        <w:t xml:space="preserve"> to automatically detect faces. If the "Confidence Score" is below 0.6 (60%), the system flags the video for "Essential Upscaling."</w:t>
+        <w:t>AI Tier (Hugging Face): We use a lightweight model like arnabdhar/YOLOv8-Face-Detection or mediapipe to automatically detect faces. If the "Confidence Score" is below 0.6 (60%), the system flags the video for "Essential Upscaling."</w:t>
       </w:r>
     </w:p>
     <w:p>
@@ -391,23 +355,7 @@
           <w:rFonts w:ascii="Times New Roman" w:hAnsi="Times New Roman" w:cs="Times New Roman"/>
           <w:color w:val="CC66FF"/>
         </w:rPr>
-        <w:t xml:space="preserve">. Standard Resolution: Pixel count </w:t>
-      </w:r>
-      <w:proofErr w:type="spellStart"/>
-      <w:r>
-        <w:rPr>
-          <w:rFonts w:ascii="Times New Roman" w:hAnsi="Times New Roman" w:cs="Times New Roman"/>
-          <w:color w:val="CC66FF"/>
-        </w:rPr>
-        <w:t>e.g</w:t>
-      </w:r>
-      <w:proofErr w:type="spellEnd"/>
-      <w:r>
-        <w:rPr>
-          <w:rFonts w:ascii="Times New Roman" w:hAnsi="Times New Roman" w:cs="Times New Roman"/>
-          <w:color w:val="CC66FF"/>
-        </w:rPr>
-        <w:t xml:space="preserve"> 720 x 480 pixels saying horizontal x vertical pixels counts. The vertical pixels count is considered for quality here it is 480p.</w:t>
+        <w:t>. Standard Resolution: Pixel count e.g 720 x 480 pixels saying horizontal x vertical pixels counts. The vertical pixels count is considered for quality here it is 480p.</w:t>
       </w:r>
       <w:r>
         <w:rPr>
@@ -535,7 +483,6 @@
         </w:rPr>
         <w:t xml:space="preserve">Sometimes, a file might claim to be 1080p, but a resolution check reveals it was </w:t>
       </w:r>
-      <w:proofErr w:type="gramStart"/>
       <w:r>
         <w:rPr>
           <w:rFonts w:ascii="Times New Roman" w:hAnsi="Times New Roman" w:cs="Times New Roman"/>
@@ -543,16 +490,7 @@
           <w:szCs w:val="28"/>
         </w:rPr>
         <w:lastRenderedPageBreak/>
-        <w:t>actually</w:t>
-      </w:r>
-      <w:proofErr w:type="gramEnd"/>
-      <w:r>
-        <w:rPr>
-          <w:rFonts w:ascii="Times New Roman" w:hAnsi="Times New Roman" w:cs="Times New Roman"/>
-          <w:sz w:val="28"/>
-          <w:szCs w:val="28"/>
-        </w:rPr>
-        <w:t xml:space="preserve"> a 480p video saved in a 1080p container. The check identifies the </w:t>
+        <w:t xml:space="preserve">actually a 480p video saved in a 1080p container. The check identifies the </w:t>
       </w:r>
       <w:r>
         <w:rPr>
@@ -671,23 +609,7 @@
           <w:rFonts w:ascii="Times New Roman" w:hAnsi="Times New Roman" w:cs="Times New Roman"/>
           <w:color w:val="CC66FF"/>
         </w:rPr>
-        <w:t xml:space="preserve"> Low bitrate causing blurry and square blocks (</w:t>
-      </w:r>
-      <w:proofErr w:type="spellStart"/>
-      <w:r>
-        <w:rPr>
-          <w:rFonts w:ascii="Times New Roman" w:hAnsi="Times New Roman" w:cs="Times New Roman"/>
-          <w:color w:val="CC66FF"/>
-        </w:rPr>
-        <w:t>macroblocking</w:t>
-      </w:r>
-      <w:proofErr w:type="spellEnd"/>
-      <w:r>
-        <w:rPr>
-          <w:rFonts w:ascii="Times New Roman" w:hAnsi="Times New Roman" w:cs="Times New Roman"/>
-          <w:color w:val="CC66FF"/>
-        </w:rPr>
-        <w:t>)</w:t>
+        <w:t xml:space="preserve"> Low bitrate causing blurry and square blocks (macroblocking)</w:t>
       </w:r>
       <w:r>
         <w:rPr>
@@ -935,87 +857,52 @@
         <w:rPr>
           <w:color w:val="CC66FF"/>
         </w:rPr>
-        <w:t xml:space="preserve"> The matrix has lots of "spikes" (sharp edges like a nose or a license plate letter</w:t>
-      </w:r>
-      <w:proofErr w:type="gramStart"/>
-      <w:r>
-        <w:rPr>
+        <w:t xml:space="preserve"> The matrix has lots of "spikes" (sharp edges like a nose or a license plate letter).</w:t>
+      </w:r>
+      <w:r>
+        <w:rPr>
+          <w:rFonts w:ascii="Times New Roman" w:hAnsi="Times New Roman" w:cs="Times New Roman"/>
+          <w:b/>
+          <w:bCs/>
           <w:color w:val="CC66FF"/>
         </w:rPr>
-        <w:t>).</w:t>
-      </w:r>
-      <w:r>
-        <w:rPr>
-          <w:rFonts w:ascii="Times New Roman" w:hAnsi="Times New Roman" w:cs="Times New Roman"/>
-          <w:b/>
-          <w:bCs/>
+        <w:t>Low Variance:</w:t>
+      </w:r>
+      <w:r>
+        <w:rPr>
+          <w:rFonts w:ascii="Times New Roman" w:hAnsi="Times New Roman" w:cs="Times New Roman"/>
           <w:color w:val="CC66FF"/>
         </w:rPr>
-        <w:t>Low</w:t>
-      </w:r>
-      <w:proofErr w:type="gramEnd"/>
-      <w:r>
-        <w:rPr>
-          <w:rFonts w:ascii="Times New Roman" w:hAnsi="Times New Roman" w:cs="Times New Roman"/>
-          <w:b/>
-          <w:bCs/>
+        <w:t xml:space="preserve"> The matrix is "flat" (blurry, out of focus).</w:t>
+      </w:r>
+    </w:p>
+    <w:p>
+      <w:pPr>
+        <w:rPr>
           <w:color w:val="CC66FF"/>
         </w:rPr>
-        <w:t xml:space="preserve"> Variance:</w:t>
-      </w:r>
-      <w:r>
-        <w:rPr>
-          <w:rFonts w:ascii="Times New Roman" w:hAnsi="Times New Roman" w:cs="Times New Roman"/>
+      </w:pPr>
+      <w:r>
+        <w:rPr>
+          <w:b/>
+          <w:bCs/>
           <w:color w:val="CC66FF"/>
         </w:rPr>
-        <w:t xml:space="preserve"> The matrix is "flat" (blurry, out of focus).</w:t>
-      </w:r>
-    </w:p>
-    <w:p>
-      <w:pPr>
+        <w:t>Signal:</w:t>
+      </w:r>
+      <w:r>
         <w:rPr>
           <w:color w:val="CC66FF"/>
         </w:rPr>
-      </w:pPr>
+        <w:t xml:space="preserve"> The meaningful pattern of numbers that forms a face.</w:t>
+      </w:r>
       <w:r>
         <w:rPr>
           <w:b/>
           <w:bCs/>
           <w:color w:val="CC66FF"/>
         </w:rPr>
-        <w:t>Signal:</w:t>
-      </w:r>
-      <w:r>
-        <w:rPr>
-          <w:color w:val="CC66FF"/>
-        </w:rPr>
-        <w:t xml:space="preserve"> The meaningful pattern of numbers that forms a </w:t>
-      </w:r>
-      <w:proofErr w:type="spellStart"/>
-      <w:proofErr w:type="gramStart"/>
-      <w:r>
-        <w:rPr>
-          <w:color w:val="CC66FF"/>
-        </w:rPr>
-        <w:t>face.</w:t>
-      </w:r>
-      <w:r>
-        <w:rPr>
-          <w:b/>
-          <w:bCs/>
-          <w:color w:val="CC66FF"/>
-        </w:rPr>
-        <w:t>Noise</w:t>
-      </w:r>
-      <w:proofErr w:type="spellEnd"/>
-      <w:proofErr w:type="gramEnd"/>
-      <w:r>
-        <w:rPr>
-          <w:b/>
-          <w:bCs/>
-          <w:color w:val="CC66FF"/>
-        </w:rPr>
-        <w:t>:</w:t>
+        <w:t>Noise:</w:t>
       </w:r>
       <w:r>
         <w:rPr>
@@ -1265,25 +1152,7 @@
           <w:sz w:val="28"/>
           <w:szCs w:val="28"/>
         </w:rPr>
-        <w:t xml:space="preserve">The higher the res and </w:t>
-      </w:r>
-      <w:proofErr w:type="spellStart"/>
-      <w:r>
-        <w:rPr>
-          <w:rFonts w:ascii="Times New Roman" w:hAnsi="Times New Roman" w:cs="Times New Roman"/>
-          <w:sz w:val="28"/>
-          <w:szCs w:val="28"/>
-        </w:rPr>
-        <w:t>br</w:t>
-      </w:r>
-      <w:proofErr w:type="spellEnd"/>
-      <w:r>
-        <w:rPr>
-          <w:rFonts w:ascii="Times New Roman" w:hAnsi="Times New Roman" w:cs="Times New Roman"/>
-          <w:sz w:val="28"/>
-          <w:szCs w:val="28"/>
-        </w:rPr>
-        <w:t xml:space="preserve"> the quality and clarity is high.</w:t>
+        <w:t>The higher the res and br the quality and clarity is high.</w:t>
       </w:r>
     </w:p>
     <w:p>
@@ -1494,51 +1363,7 @@
           <w:sz w:val="28"/>
           <w:szCs w:val="28"/>
         </w:rPr>
-        <w:t xml:space="preserve">The </w:t>
-      </w:r>
-      <w:proofErr w:type="spellStart"/>
-      <w:r>
-        <w:rPr>
-          <w:rFonts w:ascii="Times New Roman" w:hAnsi="Times New Roman" w:cs="Times New Roman"/>
-          <w:b/>
-          <w:bCs/>
-          <w:sz w:val="28"/>
-          <w:szCs w:val="28"/>
-        </w:rPr>
-        <w:t>Upscaler</w:t>
-      </w:r>
-      <w:proofErr w:type="spellEnd"/>
-      <w:r>
-        <w:rPr>
-          <w:rFonts w:ascii="Times New Roman" w:hAnsi="Times New Roman" w:cs="Times New Roman"/>
-          <w:b/>
-          <w:bCs/>
-          <w:sz w:val="28"/>
-          <w:szCs w:val="28"/>
-        </w:rPr>
-        <w:t xml:space="preserve"> (Real-ESRGAN / </w:t>
-      </w:r>
-      <w:proofErr w:type="spellStart"/>
-      <w:r>
-        <w:rPr>
-          <w:rFonts w:ascii="Times New Roman" w:hAnsi="Times New Roman" w:cs="Times New Roman"/>
-          <w:b/>
-          <w:bCs/>
-          <w:sz w:val="28"/>
-          <w:szCs w:val="28"/>
-        </w:rPr>
-        <w:t>SwinIR</w:t>
-      </w:r>
-      <w:proofErr w:type="spellEnd"/>
-      <w:r>
-        <w:rPr>
-          <w:rFonts w:ascii="Times New Roman" w:hAnsi="Times New Roman" w:cs="Times New Roman"/>
-          <w:b/>
-          <w:bCs/>
-          <w:sz w:val="28"/>
-          <w:szCs w:val="28"/>
-        </w:rPr>
-        <w:t>):</w:t>
+        <w:t>The Upscaler (Real-ESRGAN / SwinIR):</w:t>
       </w:r>
       <w:r>
         <w:rPr>
@@ -1618,29 +1443,7 @@
           <w:sz w:val="28"/>
           <w:szCs w:val="28"/>
         </w:rPr>
-        <w:t xml:space="preserve">The Face Refinement Node (GFP-GAN / </w:t>
-      </w:r>
-      <w:proofErr w:type="spellStart"/>
-      <w:r>
-        <w:rPr>
-          <w:rFonts w:ascii="Times New Roman" w:hAnsi="Times New Roman" w:cs="Times New Roman"/>
-          <w:b/>
-          <w:bCs/>
-          <w:sz w:val="28"/>
-          <w:szCs w:val="28"/>
-        </w:rPr>
-        <w:t>RestoreFormer</w:t>
-      </w:r>
-      <w:proofErr w:type="spellEnd"/>
-      <w:r>
-        <w:rPr>
-          <w:rFonts w:ascii="Times New Roman" w:hAnsi="Times New Roman" w:cs="Times New Roman"/>
-          <w:b/>
-          <w:bCs/>
-          <w:sz w:val="28"/>
-          <w:szCs w:val="28"/>
-        </w:rPr>
-        <w:t>++):</w:t>
+        <w:t>The Face Refinement Node (GFP-GAN / RestoreFormer++):</w:t>
       </w:r>
       <w:r>
         <w:rPr>
@@ -1714,18 +1517,8 @@
           <w:sz w:val="28"/>
           <w:szCs w:val="28"/>
         </w:rPr>
-        <w:t xml:space="preserve"> to define </w:t>
-      </w:r>
-      <w:proofErr w:type="spellStart"/>
-      <w:r>
-        <w:rPr>
-          <w:rFonts w:ascii="Times New Roman" w:hAnsi="Times New Roman" w:cs="Times New Roman"/>
-          <w:sz w:val="28"/>
-          <w:szCs w:val="28"/>
-        </w:rPr>
-        <w:t>boundries</w:t>
-      </w:r>
-      <w:proofErr w:type="spellEnd"/>
+        <w:t xml:space="preserve"> to define boundries</w:t>
+      </w:r>
       <w:r>
         <w:rPr>
           <w:rFonts w:ascii="Times New Roman" w:hAnsi="Times New Roman" w:cs="Times New Roman"/>
@@ -2769,20 +2562,1474 @@
     </w:tbl>
     <w:p>
       <w:pPr>
-        <w:spacing w:before="100" w:beforeAutospacing="1" w:after="100" w:afterAutospacing="1" w:line="240" w:lineRule="auto"/>
-        <w:rPr>
-          <w:rFonts w:ascii="Times New Roman" w:eastAsia="Times New Roman" w:hAnsi="Times New Roman" w:cs="Times New Roman"/>
-          <w:kern w:val="0"/>
-          <w14:ligatures w14:val="none"/>
-        </w:rPr>
-      </w:pPr>
-    </w:p>
-    <w:p>
-      <w:pPr>
-        <w:spacing w:before="100" w:beforeAutospacing="1" w:after="100" w:afterAutospacing="1" w:line="240" w:lineRule="auto"/>
-        <w:rPr>
-          <w:rFonts w:ascii="Times New Roman" w:eastAsia="Times New Roman" w:hAnsi="Times New Roman" w:cs="Times New Roman"/>
-          <w:kern w:val="0"/>
+        <w:spacing w:before="100" w:beforeAutospacing="1" w:after="100" w:afterAutospacing="1" w:line="276" w:lineRule="auto"/>
+        <w:rPr>
+          <w:rFonts w:ascii="Times New Roman" w:eastAsia="Times New Roman" w:hAnsi="Times New Roman" w:cs="Times New Roman"/>
+          <w:kern w:val="0"/>
+          <w:sz w:val="28"/>
+          <w:szCs w:val="28"/>
+          <w14:ligatures w14:val="none"/>
+        </w:rPr>
+      </w:pPr>
+      <w:r>
+        <w:rPr>
+          <w:rFonts w:ascii="Times New Roman" w:eastAsia="Times New Roman" w:hAnsi="Times New Roman" w:cs="Times New Roman"/>
+          <w:kern w:val="0"/>
+          <w:sz w:val="28"/>
+          <w:szCs w:val="28"/>
+          <w14:ligatures w14:val="none"/>
+        </w:rPr>
+        <w:lastRenderedPageBreak/>
+        <w:t xml:space="preserve">For the pipeline 2 </w:t>
+      </w:r>
+      <w:r>
+        <w:rPr>
+          <w:rFonts w:ascii="Times New Roman" w:eastAsia="Times New Roman" w:hAnsi="Times New Roman" w:cs="Times New Roman"/>
+          <w:b/>
+          <w:bCs/>
+          <w:kern w:val="0"/>
+          <w:sz w:val="32"/>
+          <w:szCs w:val="32"/>
+          <w14:ligatures w14:val="none"/>
+        </w:rPr>
+        <w:t>Linear Sequential Reconstruction</w:t>
+      </w:r>
+      <w:r>
+        <w:rPr>
+          <w:rFonts w:ascii="Times New Roman" w:eastAsia="Times New Roman" w:hAnsi="Times New Roman" w:cs="Times New Roman"/>
+          <w:kern w:val="0"/>
+          <w:sz w:val="32"/>
+          <w:szCs w:val="32"/>
+          <w14:ligatures w14:val="none"/>
+        </w:rPr>
+        <w:t xml:space="preserve"> </w:t>
+      </w:r>
+      <w:r>
+        <w:rPr>
+          <w:rFonts w:ascii="Times New Roman" w:eastAsia="Times New Roman" w:hAnsi="Times New Roman" w:cs="Times New Roman"/>
+          <w:kern w:val="0"/>
+          <w:sz w:val="28"/>
+          <w:szCs w:val="28"/>
+          <w14:ligatures w14:val="none"/>
+        </w:rPr>
+        <w:t>Architecture is employed.</w:t>
+      </w:r>
+      <w:r>
+        <w:rPr>
+          <w:rFonts w:ascii="Times New Roman" w:eastAsia="Times New Roman" w:hAnsi="Times New Roman" w:cs="Times New Roman"/>
+          <w:kern w:val="0"/>
+          <w:sz w:val="28"/>
+          <w:szCs w:val="28"/>
+          <w14:ligatures w14:val="none"/>
+        </w:rPr>
+        <w:t xml:space="preserve"> This is made up of a number of nodes where each technique </w:t>
+      </w:r>
+      <w:r>
+        <w:rPr>
+          <w:rFonts w:ascii="Times New Roman" w:eastAsia="Times New Roman" w:hAnsi="Times New Roman" w:cs="Times New Roman"/>
+          <w:kern w:val="0"/>
+          <w:sz w:val="28"/>
+          <w:szCs w:val="28"/>
+          <w14:ligatures w14:val="none"/>
+        </w:rPr>
+        <w:t>is</w:t>
+      </w:r>
+      <w:r>
+        <w:rPr>
+          <w:rFonts w:ascii="Times New Roman" w:eastAsia="Times New Roman" w:hAnsi="Times New Roman" w:cs="Times New Roman"/>
+          <w:kern w:val="0"/>
+          <w:sz w:val="28"/>
+          <w:szCs w:val="28"/>
+          <w14:ligatures w14:val="none"/>
+        </w:rPr>
+        <w:t xml:space="preserve"> carried with human intervention</w:t>
+      </w:r>
+      <w:r>
+        <w:rPr>
+          <w:rFonts w:ascii="Times New Roman" w:eastAsia="Times New Roman" w:hAnsi="Times New Roman" w:cs="Times New Roman"/>
+          <w:kern w:val="0"/>
+          <w:sz w:val="28"/>
+          <w:szCs w:val="28"/>
+          <w14:ligatures w14:val="none"/>
+        </w:rPr>
+        <w:t xml:space="preserve"> </w:t>
+      </w:r>
+      <w:r>
+        <w:rPr>
+          <w:rFonts w:ascii="Times New Roman" w:eastAsia="Times New Roman" w:hAnsi="Times New Roman" w:cs="Times New Roman"/>
+          <w:kern w:val="0"/>
+          <w:sz w:val="28"/>
+          <w:szCs w:val="28"/>
+          <w14:ligatures w14:val="none"/>
+        </w:rPr>
+        <w:t xml:space="preserve">(Human </w:t>
+      </w:r>
+      <w:r>
+        <w:rPr>
+          <w:rFonts w:ascii="Times New Roman" w:eastAsia="Times New Roman" w:hAnsi="Times New Roman" w:cs="Times New Roman"/>
+          <w:kern w:val="0"/>
+          <w:sz w:val="28"/>
+          <w:szCs w:val="28"/>
+          <w14:ligatures w14:val="none"/>
+        </w:rPr>
+        <w:t>i</w:t>
+      </w:r>
+      <w:r>
+        <w:rPr>
+          <w:rFonts w:ascii="Times New Roman" w:eastAsia="Times New Roman" w:hAnsi="Times New Roman" w:cs="Times New Roman"/>
+          <w:kern w:val="0"/>
+          <w:sz w:val="28"/>
+          <w:szCs w:val="28"/>
+          <w14:ligatures w14:val="none"/>
+        </w:rPr>
+        <w:t xml:space="preserve">n </w:t>
+      </w:r>
+      <w:r>
+        <w:rPr>
+          <w:rFonts w:ascii="Times New Roman" w:eastAsia="Times New Roman" w:hAnsi="Times New Roman" w:cs="Times New Roman"/>
+          <w:kern w:val="0"/>
+          <w:sz w:val="28"/>
+          <w:szCs w:val="28"/>
+          <w14:ligatures w14:val="none"/>
+        </w:rPr>
+        <w:t>t</w:t>
+      </w:r>
+      <w:r>
+        <w:rPr>
+          <w:rFonts w:ascii="Times New Roman" w:eastAsia="Times New Roman" w:hAnsi="Times New Roman" w:cs="Times New Roman"/>
+          <w:kern w:val="0"/>
+          <w:sz w:val="28"/>
+          <w:szCs w:val="28"/>
+          <w14:ligatures w14:val="none"/>
+        </w:rPr>
+        <w:t>he Loop)</w:t>
+      </w:r>
+      <w:r>
+        <w:rPr>
+          <w:rFonts w:ascii="Times New Roman" w:eastAsia="Times New Roman" w:hAnsi="Times New Roman" w:cs="Times New Roman"/>
+          <w:kern w:val="0"/>
+          <w:sz w:val="28"/>
+          <w:szCs w:val="28"/>
+          <w14:ligatures w14:val="none"/>
+        </w:rPr>
+        <w:t>.</w:t>
+      </w:r>
+      <w:r>
+        <w:rPr>
+          <w:rFonts w:ascii="Times New Roman" w:eastAsia="Times New Roman" w:hAnsi="Times New Roman" w:cs="Times New Roman"/>
+          <w:kern w:val="0"/>
+          <w:sz w:val="28"/>
+          <w:szCs w:val="28"/>
+          <w14:ligatures w14:val="none"/>
+        </w:rPr>
+        <w:t xml:space="preserve"> </w:t>
+      </w:r>
+      <w:r>
+        <w:rPr>
+          <w:rFonts w:ascii="Times New Roman" w:eastAsia="Times New Roman" w:hAnsi="Times New Roman" w:cs="Times New Roman"/>
+          <w:kern w:val="0"/>
+          <w:sz w:val="28"/>
+          <w:szCs w:val="28"/>
+          <w14:ligatures w14:val="none"/>
+        </w:rPr>
+        <w:t>In this design, each technique is a "node." The video passes through the node, and the investigator decides whether to commit that change or bypass it. The "State" of the video is carried forward to the next expert.</w:t>
+      </w:r>
+    </w:p>
+    <w:p>
+      <w:pPr>
+        <w:spacing w:before="100" w:beforeAutospacing="1" w:after="100" w:afterAutospacing="1" w:line="276" w:lineRule="auto"/>
+        <w:rPr>
+          <w:rFonts w:ascii="Times New Roman" w:eastAsia="Times New Roman" w:hAnsi="Times New Roman" w:cs="Times New Roman"/>
+          <w:kern w:val="0"/>
+          <w:sz w:val="28"/>
+          <w:szCs w:val="28"/>
+          <w14:ligatures w14:val="none"/>
+        </w:rPr>
+      </w:pPr>
+    </w:p>
+    <w:p>
+      <w:pPr>
+        <w:spacing w:before="100" w:beforeAutospacing="1" w:after="100" w:afterAutospacing="1" w:line="276" w:lineRule="auto"/>
+        <w:rPr>
+          <w:rFonts w:ascii="Times New Roman" w:eastAsia="Times New Roman" w:hAnsi="Times New Roman" w:cs="Times New Roman"/>
+          <w:kern w:val="0"/>
+          <w:sz w:val="28"/>
+          <w:szCs w:val="28"/>
+          <w14:ligatures w14:val="none"/>
+        </w:rPr>
+      </w:pPr>
+      <w:r>
+        <w:rPr>
+          <w:rFonts w:ascii="Times New Roman" w:eastAsia="Times New Roman" w:hAnsi="Times New Roman" w:cs="Times New Roman"/>
+          <w:kern w:val="0"/>
+          <w:sz w:val="28"/>
+          <w:szCs w:val="28"/>
+          <w14:ligatures w14:val="none"/>
+        </w:rPr>
+        <w:t>Here is the detailed implementation details for the treatment process.</w:t>
+      </w:r>
+    </w:p>
+    <w:p>
+      <w:pPr>
+        <w:spacing w:before="100" w:beforeAutospacing="1" w:after="100" w:afterAutospacing="1" w:line="276" w:lineRule="auto"/>
+        <w:rPr>
+          <w:rFonts w:ascii="Times New Roman" w:eastAsia="Times New Roman" w:hAnsi="Times New Roman" w:cs="Times New Roman"/>
+          <w:kern w:val="0"/>
+          <w:sz w:val="28"/>
+          <w:szCs w:val="28"/>
+          <w14:ligatures w14:val="none"/>
+        </w:rPr>
+      </w:pPr>
+      <w:r>
+        <w:rPr>
+          <w:rFonts w:ascii="Times New Roman" w:eastAsia="Times New Roman" w:hAnsi="Times New Roman" w:cs="Times New Roman"/>
+          <w:kern w:val="0"/>
+          <w:sz w:val="28"/>
+          <w:szCs w:val="28"/>
+          <w14:ligatures w14:val="none"/>
+        </w:rPr>
+        <w:t>Nodes:</w:t>
+      </w:r>
+    </w:p>
+    <w:p>
+      <w:pPr>
+        <w:spacing w:before="100" w:beforeAutospacing="1" w:after="100" w:afterAutospacing="1" w:line="276" w:lineRule="auto"/>
+        <w:rPr>
+          <w:rFonts w:ascii="Times New Roman" w:eastAsia="Times New Roman" w:hAnsi="Times New Roman" w:cs="Times New Roman"/>
+          <w:b/>
+          <w:bCs/>
+          <w:kern w:val="0"/>
+          <w:sz w:val="28"/>
+          <w:szCs w:val="28"/>
+          <w14:ligatures w14:val="none"/>
+        </w:rPr>
+      </w:pPr>
+      <w:r>
+        <w:rPr>
+          <w:rFonts w:ascii="Times New Roman" w:eastAsia="Times New Roman" w:hAnsi="Times New Roman" w:cs="Times New Roman"/>
+          <w:kern w:val="0"/>
+          <w:sz w:val="28"/>
+          <w:szCs w:val="28"/>
+          <w14:ligatures w14:val="none"/>
+        </w:rPr>
+        <w:t xml:space="preserve">1. </w:t>
+      </w:r>
+      <w:r>
+        <w:rPr>
+          <w:rFonts w:ascii="Times New Roman" w:eastAsia="Times New Roman" w:hAnsi="Times New Roman" w:cs="Times New Roman"/>
+          <w:b/>
+          <w:bCs/>
+          <w:kern w:val="0"/>
+          <w:sz w:val="28"/>
+          <w:szCs w:val="28"/>
+          <w14:ligatures w14:val="none"/>
+        </w:rPr>
+        <w:t>Bitrate Improver</w:t>
+      </w:r>
+    </w:p>
+    <w:p>
+      <w:pPr>
+        <w:spacing w:before="100" w:beforeAutospacing="1" w:after="100" w:afterAutospacing="1" w:line="276" w:lineRule="auto"/>
+        <w:rPr>
+          <w:rFonts w:ascii="Times New Roman" w:eastAsia="Times New Roman" w:hAnsi="Times New Roman" w:cs="Times New Roman"/>
+          <w:kern w:val="0"/>
+          <w:sz w:val="28"/>
+          <w:szCs w:val="28"/>
+          <w14:ligatures w14:val="none"/>
+        </w:rPr>
+      </w:pPr>
+      <w:r>
+        <w:rPr>
+          <w:rFonts w:ascii="Times New Roman" w:eastAsia="Times New Roman" w:hAnsi="Times New Roman" w:cs="Times New Roman"/>
+          <w:kern w:val="0"/>
+          <w:sz w:val="28"/>
+          <w:szCs w:val="28"/>
+          <w14:ligatures w14:val="none"/>
+        </w:rPr>
+        <w:t xml:space="preserve">When a video is compressed (Low Bitrate), the encoder groups pixels into </w:t>
+      </w:r>
+      <w:r>
+        <w:rPr>
+          <w:rFonts w:ascii="Times New Roman" w:eastAsia="Times New Roman" w:hAnsi="Times New Roman" w:cs="Times New Roman"/>
+          <w:b/>
+          <w:bCs/>
+          <w:kern w:val="0"/>
+          <w:sz w:val="28"/>
+          <w:szCs w:val="28"/>
+          <w14:ligatures w14:val="none"/>
+        </w:rPr>
+        <w:t xml:space="preserve">8 </w:t>
+      </w:r>
+      <w:r>
+        <w:rPr>
+          <w:rFonts w:ascii="Times New Roman" w:eastAsia="Times New Roman" w:hAnsi="Times New Roman" w:cs="Times New Roman"/>
+          <w:b/>
+          <w:bCs/>
+          <w:kern w:val="0"/>
+          <w:sz w:val="28"/>
+          <w:szCs w:val="28"/>
+          <w14:ligatures w14:val="none"/>
+        </w:rPr>
+        <w:t>x</w:t>
+      </w:r>
+      <w:r>
+        <w:rPr>
+          <w:rFonts w:ascii="Times New Roman" w:eastAsia="Times New Roman" w:hAnsi="Times New Roman" w:cs="Times New Roman"/>
+          <w:b/>
+          <w:bCs/>
+          <w:kern w:val="0"/>
+          <w:sz w:val="28"/>
+          <w:szCs w:val="28"/>
+          <w14:ligatures w14:val="none"/>
+        </w:rPr>
+        <w:t xml:space="preserve"> 8 or 16 </w:t>
+      </w:r>
+      <w:r>
+        <w:rPr>
+          <w:rFonts w:ascii="Times New Roman" w:eastAsia="Times New Roman" w:hAnsi="Times New Roman" w:cs="Times New Roman"/>
+          <w:b/>
+          <w:bCs/>
+          <w:kern w:val="0"/>
+          <w:sz w:val="28"/>
+          <w:szCs w:val="28"/>
+          <w14:ligatures w14:val="none"/>
+        </w:rPr>
+        <w:t>x</w:t>
+      </w:r>
+      <w:r>
+        <w:rPr>
+          <w:rFonts w:ascii="Times New Roman" w:eastAsia="Times New Roman" w:hAnsi="Times New Roman" w:cs="Times New Roman"/>
+          <w:b/>
+          <w:bCs/>
+          <w:kern w:val="0"/>
+          <w:sz w:val="28"/>
+          <w:szCs w:val="28"/>
+          <w14:ligatures w14:val="none"/>
+        </w:rPr>
+        <w:t xml:space="preserve"> 16 Macroblocks</w:t>
+      </w:r>
+      <w:r>
+        <w:rPr>
+          <w:rFonts w:ascii="Times New Roman" w:eastAsia="Times New Roman" w:hAnsi="Times New Roman" w:cs="Times New Roman"/>
+          <w:kern w:val="0"/>
+          <w:sz w:val="28"/>
+          <w:szCs w:val="28"/>
+          <w14:ligatures w14:val="none"/>
+        </w:rPr>
+        <w:t>.</w:t>
+      </w:r>
+    </w:p>
+    <w:p>
+      <w:pPr>
+        <w:numPr>
+          <w:ilvl w:val="0"/>
+          <w:numId w:val="10"/>
+        </w:numPr>
+        <w:spacing w:before="100" w:beforeAutospacing="1" w:after="100" w:afterAutospacing="1" w:line="276" w:lineRule="auto"/>
+        <w:rPr>
+          <w:rFonts w:ascii="Times New Roman" w:eastAsia="Times New Roman" w:hAnsi="Times New Roman" w:cs="Times New Roman"/>
+          <w:kern w:val="0"/>
+          <w:sz w:val="28"/>
+          <w:szCs w:val="28"/>
+          <w14:ligatures w14:val="none"/>
+        </w:rPr>
+      </w:pPr>
+      <w:r>
+        <w:rPr>
+          <w:rFonts w:ascii="Times New Roman" w:eastAsia="Times New Roman" w:hAnsi="Times New Roman" w:cs="Times New Roman"/>
+          <w:b/>
+          <w:bCs/>
+          <w:kern w:val="0"/>
+          <w:sz w:val="28"/>
+          <w:szCs w:val="28"/>
+          <w14:ligatures w14:val="none"/>
+        </w:rPr>
+        <w:t>Original:</w:t>
+      </w:r>
+      <w:r>
+        <w:rPr>
+          <w:rFonts w:ascii="Times New Roman" w:eastAsia="Times New Roman" w:hAnsi="Times New Roman" w:cs="Times New Roman"/>
+          <w:kern w:val="0"/>
+          <w:sz w:val="28"/>
+          <w:szCs w:val="28"/>
+          <w14:ligatures w14:val="none"/>
+        </w:rPr>
+        <w:t xml:space="preserve"> Every pixel has a unique value (e.g., [120, 122, 119]).</w:t>
+      </w:r>
+    </w:p>
+    <w:p>
+      <w:pPr>
+        <w:numPr>
+          <w:ilvl w:val="0"/>
+          <w:numId w:val="10"/>
+        </w:numPr>
+        <w:spacing w:before="100" w:beforeAutospacing="1" w:after="100" w:afterAutospacing="1" w:line="276" w:lineRule="auto"/>
+        <w:rPr>
+          <w:rFonts w:ascii="Times New Roman" w:eastAsia="Times New Roman" w:hAnsi="Times New Roman" w:cs="Times New Roman"/>
+          <w:kern w:val="0"/>
+          <w:sz w:val="28"/>
+          <w:szCs w:val="28"/>
+          <w14:ligatures w14:val="none"/>
+        </w:rPr>
+      </w:pPr>
+      <w:r>
+        <w:rPr>
+          <w:rFonts w:ascii="Times New Roman" w:eastAsia="Times New Roman" w:hAnsi="Times New Roman" w:cs="Times New Roman"/>
+          <w:b/>
+          <w:bCs/>
+          <w:kern w:val="0"/>
+          <w:sz w:val="28"/>
+          <w:szCs w:val="28"/>
+          <w14:ligatures w14:val="none"/>
+        </w:rPr>
+        <w:t>Compressed:</w:t>
+      </w:r>
+      <w:r>
+        <w:rPr>
+          <w:rFonts w:ascii="Times New Roman" w:eastAsia="Times New Roman" w:hAnsi="Times New Roman" w:cs="Times New Roman"/>
+          <w:kern w:val="0"/>
+          <w:sz w:val="28"/>
+          <w:szCs w:val="28"/>
+          <w14:ligatures w14:val="none"/>
+        </w:rPr>
+        <w:t xml:space="preserve"> The entire 8</w:t>
+      </w:r>
+      <w:r>
+        <w:rPr>
+          <w:rFonts w:ascii="Times New Roman" w:eastAsia="Times New Roman" w:hAnsi="Times New Roman" w:cs="Times New Roman"/>
+          <w:kern w:val="0"/>
+          <w:sz w:val="28"/>
+          <w:szCs w:val="28"/>
+          <w14:ligatures w14:val="none"/>
+        </w:rPr>
+        <w:t xml:space="preserve"> x</w:t>
+      </w:r>
+      <w:r>
+        <w:rPr>
+          <w:rFonts w:ascii="Times New Roman" w:eastAsia="Times New Roman" w:hAnsi="Times New Roman" w:cs="Times New Roman"/>
+          <w:kern w:val="0"/>
+          <w:sz w:val="28"/>
+          <w:szCs w:val="28"/>
+          <w14:ligatures w14:val="none"/>
+        </w:rPr>
+        <w:t xml:space="preserve"> 8 block is forced to a single average value (e.g., [120, 120, 120]</w:t>
+      </w:r>
+      <w:r>
+        <w:rPr>
+          <w:rFonts w:ascii="Times New Roman" w:eastAsia="Times New Roman" w:hAnsi="Times New Roman" w:cs="Times New Roman"/>
+          <w:kern w:val="0"/>
+          <w:sz w:val="28"/>
+          <w:szCs w:val="28"/>
+          <w14:ligatures w14:val="none"/>
+        </w:rPr>
+        <w:t>)</w:t>
+      </w:r>
+      <w:r>
+        <w:rPr>
+          <w:rFonts w:ascii="Times New Roman" w:eastAsia="Times New Roman" w:hAnsi="Times New Roman" w:cs="Times New Roman"/>
+          <w:kern w:val="0"/>
+          <w:sz w:val="28"/>
+          <w:szCs w:val="28"/>
+          <w14:ligatures w14:val="none"/>
+        </w:rPr>
+        <w:t>.</w:t>
+      </w:r>
+    </w:p>
+    <w:p>
+      <w:pPr>
+        <w:numPr>
+          <w:ilvl w:val="0"/>
+          <w:numId w:val="10"/>
+        </w:numPr>
+        <w:spacing w:before="100" w:beforeAutospacing="1" w:after="100" w:afterAutospacing="1" w:line="276" w:lineRule="auto"/>
+        <w:rPr>
+          <w:rFonts w:ascii="Times New Roman" w:eastAsia="Times New Roman" w:hAnsi="Times New Roman" w:cs="Times New Roman"/>
+          <w:kern w:val="0"/>
+          <w:sz w:val="28"/>
+          <w:szCs w:val="28"/>
+          <w14:ligatures w14:val="none"/>
+        </w:rPr>
+      </w:pPr>
+      <w:r>
+        <w:rPr>
+          <w:rFonts w:ascii="Times New Roman" w:eastAsia="Times New Roman" w:hAnsi="Times New Roman" w:cs="Times New Roman"/>
+          <w:b/>
+          <w:bCs/>
+          <w:kern w:val="0"/>
+          <w:sz w:val="28"/>
+          <w:szCs w:val="28"/>
+          <w14:ligatures w14:val="none"/>
+        </w:rPr>
+        <w:t>The Fix:</w:t>
+      </w:r>
+      <w:r>
+        <w:rPr>
+          <w:rFonts w:ascii="Times New Roman" w:eastAsia="Times New Roman" w:hAnsi="Times New Roman" w:cs="Times New Roman"/>
+          <w:kern w:val="0"/>
+          <w:sz w:val="28"/>
+          <w:szCs w:val="28"/>
+          <w14:ligatures w14:val="none"/>
+        </w:rPr>
+        <w:t xml:space="preserve"> The Bitrate Improver looks at the neighbors of the block and calculates a </w:t>
+      </w:r>
+      <w:r>
+        <w:rPr>
+          <w:rFonts w:ascii="Times New Roman" w:eastAsia="Times New Roman" w:hAnsi="Times New Roman" w:cs="Times New Roman"/>
+          <w:b/>
+          <w:bCs/>
+          <w:kern w:val="0"/>
+          <w:sz w:val="28"/>
+          <w:szCs w:val="28"/>
+          <w14:ligatures w14:val="none"/>
+        </w:rPr>
+        <w:t>Gradient Interpolation</w:t>
+      </w:r>
+      <w:r>
+        <w:rPr>
+          <w:rFonts w:ascii="Times New Roman" w:eastAsia="Times New Roman" w:hAnsi="Times New Roman" w:cs="Times New Roman"/>
+          <w:kern w:val="0"/>
+          <w:sz w:val="28"/>
+          <w:szCs w:val="28"/>
+          <w14:ligatures w14:val="none"/>
+        </w:rPr>
+        <w:t>. It uses a Deep CNN to predict what the values should have been based on the surrounding motion.</w:t>
+      </w:r>
+    </w:p>
+    <w:p>
+      <w:pPr>
+        <w:spacing w:before="100" w:beforeAutospacing="1" w:after="100" w:afterAutospacing="1" w:line="276" w:lineRule="auto"/>
+        <w:rPr>
+          <w:rFonts w:ascii="Times New Roman" w:eastAsia="Times New Roman" w:hAnsi="Times New Roman" w:cs="Times New Roman"/>
+          <w:kern w:val="0"/>
+          <w:sz w:val="28"/>
+          <w:szCs w:val="28"/>
+          <w14:ligatures w14:val="none"/>
+        </w:rPr>
+      </w:pPr>
+      <w:r>
+        <w:rPr>
+          <w:rFonts w:ascii="Times New Roman" w:eastAsia="Times New Roman" w:hAnsi="Times New Roman" w:cs="Times New Roman"/>
+          <w:b/>
+          <w:bCs/>
+          <w:kern w:val="0"/>
+          <w:sz w:val="28"/>
+          <w:szCs w:val="28"/>
+          <w14:ligatures w14:val="none"/>
+        </w:rPr>
+        <w:t xml:space="preserve">Gradient Interpolation </w:t>
+      </w:r>
+      <w:r>
+        <w:rPr>
+          <w:rFonts w:ascii="Times New Roman" w:eastAsia="Times New Roman" w:hAnsi="Times New Roman" w:cs="Times New Roman"/>
+          <w:kern w:val="0"/>
+          <w:sz w:val="28"/>
+          <w:szCs w:val="28"/>
+          <w14:ligatures w14:val="none"/>
+        </w:rPr>
+        <w:t>- Filling</w:t>
+      </w:r>
+      <w:r>
+        <w:rPr>
+          <w:rFonts w:ascii="Times New Roman" w:eastAsia="Times New Roman" w:hAnsi="Times New Roman" w:cs="Times New Roman"/>
+          <w:kern w:val="0"/>
+          <w:sz w:val="28"/>
+          <w:szCs w:val="28"/>
+          <w14:ligatures w14:val="none"/>
+        </w:rPr>
+        <w:t xml:space="preserve"> in the missing data between known points to create a smooth transition</w:t>
+      </w:r>
+      <w:r>
+        <w:rPr>
+          <w:rFonts w:ascii="Times New Roman" w:eastAsia="Times New Roman" w:hAnsi="Times New Roman" w:cs="Times New Roman"/>
+          <w:kern w:val="0"/>
+          <w:sz w:val="28"/>
+          <w:szCs w:val="28"/>
+          <w14:ligatures w14:val="none"/>
+        </w:rPr>
+        <w:t>.</w:t>
+      </w:r>
+    </w:p>
+    <w:p>
+      <w:pPr>
+        <w:spacing w:before="100" w:beforeAutospacing="1" w:after="100" w:afterAutospacing="1" w:line="276" w:lineRule="auto"/>
+        <w:rPr>
+          <w:rFonts w:ascii="Times New Roman" w:eastAsia="Times New Roman" w:hAnsi="Times New Roman" w:cs="Times New Roman"/>
+          <w:kern w:val="0"/>
+          <w:sz w:val="28"/>
+          <w:szCs w:val="28"/>
+          <w14:ligatures w14:val="none"/>
+        </w:rPr>
+      </w:pPr>
+    </w:p>
+    <w:p>
+      <w:pPr>
+        <w:spacing w:before="100" w:beforeAutospacing="1" w:after="100" w:afterAutospacing="1" w:line="276" w:lineRule="auto"/>
+        <w:rPr>
+          <w:rFonts w:ascii="Times New Roman" w:eastAsia="Times New Roman" w:hAnsi="Times New Roman" w:cs="Times New Roman"/>
+          <w:b/>
+          <w:bCs/>
+          <w:kern w:val="0"/>
+          <w:sz w:val="28"/>
+          <w:szCs w:val="28"/>
+          <w14:ligatures w14:val="none"/>
+        </w:rPr>
+      </w:pPr>
+      <w:r>
+        <w:rPr>
+          <w:rFonts w:ascii="Times New Roman" w:eastAsia="Times New Roman" w:hAnsi="Times New Roman" w:cs="Times New Roman"/>
+          <w:kern w:val="0"/>
+          <w:sz w:val="28"/>
+          <w:szCs w:val="28"/>
+          <w14:ligatures w14:val="none"/>
+        </w:rPr>
+        <w:t xml:space="preserve">2. </w:t>
+      </w:r>
+      <w:r>
+        <w:rPr>
+          <w:rFonts w:ascii="Times New Roman" w:eastAsia="Times New Roman" w:hAnsi="Times New Roman" w:cs="Times New Roman"/>
+          <w:b/>
+          <w:bCs/>
+          <w:kern w:val="0"/>
+          <w:sz w:val="28"/>
+          <w:szCs w:val="28"/>
+          <w14:ligatures w14:val="none"/>
+        </w:rPr>
+        <w:t xml:space="preserve">Environmental Recovery </w:t>
+      </w:r>
+      <w:r>
+        <w:rPr>
+          <w:rFonts w:ascii="Times New Roman" w:eastAsia="Times New Roman" w:hAnsi="Times New Roman" w:cs="Times New Roman"/>
+          <w:b/>
+          <w:bCs/>
+          <w:kern w:val="0"/>
+          <w:sz w:val="28"/>
+          <w:szCs w:val="28"/>
+          <w14:ligatures w14:val="none"/>
+        </w:rPr>
+        <w:t>– Relighting &amp;</w:t>
+      </w:r>
+      <w:r>
+        <w:rPr>
+          <w:rFonts w:ascii="Times New Roman" w:eastAsia="Times New Roman" w:hAnsi="Times New Roman" w:cs="Times New Roman"/>
+          <w:b/>
+          <w:bCs/>
+          <w:kern w:val="0"/>
+          <w:sz w:val="28"/>
+          <w:szCs w:val="28"/>
+          <w14:ligatures w14:val="none"/>
+        </w:rPr>
+        <w:t xml:space="preserve"> De-Hazing</w:t>
+      </w:r>
+    </w:p>
+    <w:p>
+      <w:pPr>
+        <w:spacing w:before="100" w:beforeAutospacing="1" w:after="100" w:afterAutospacing="1" w:line="276" w:lineRule="auto"/>
+        <w:rPr>
+          <w:rFonts w:ascii="Times New Roman" w:eastAsia="Times New Roman" w:hAnsi="Times New Roman" w:cs="Times New Roman"/>
+          <w:kern w:val="0"/>
+          <w:sz w:val="28"/>
+          <w:szCs w:val="28"/>
+          <w14:ligatures w14:val="none"/>
+        </w:rPr>
+      </w:pPr>
+      <w:r>
+        <w:rPr>
+          <w:rFonts w:ascii="Times New Roman" w:eastAsia="Times New Roman" w:hAnsi="Times New Roman" w:cs="Times New Roman"/>
+          <w:kern w:val="0"/>
+          <w:sz w:val="28"/>
+          <w:szCs w:val="28"/>
+          <w14:ligatures w14:val="none"/>
+        </w:rPr>
+        <w:t>In the Indian context, CCTV often suffers from "Atmospheric Interference" (Smog in Delhi, Monsoon rain in Mumbai) or "Low-Lux" (Poor street lighting).</w:t>
+      </w:r>
+    </w:p>
+    <w:p>
+      <w:pPr>
+        <w:spacing w:before="100" w:beforeAutospacing="1" w:after="100" w:afterAutospacing="1" w:line="276" w:lineRule="auto"/>
+        <w:rPr>
+          <w:rFonts w:ascii="Times New Roman" w:eastAsia="Times New Roman" w:hAnsi="Times New Roman" w:cs="Times New Roman"/>
+          <w:kern w:val="0"/>
+          <w:sz w:val="28"/>
+          <w:szCs w:val="28"/>
+          <w14:ligatures w14:val="none"/>
+        </w:rPr>
+      </w:pPr>
+      <w:r>
+        <w:rPr>
+          <w:rFonts w:ascii="Times New Roman" w:eastAsia="Times New Roman" w:hAnsi="Times New Roman" w:cs="Times New Roman"/>
+          <w:b/>
+          <w:bCs/>
+          <w:kern w:val="0"/>
+          <w:sz w:val="28"/>
+          <w:szCs w:val="28"/>
+          <w14:ligatures w14:val="none"/>
+        </w:rPr>
+        <w:lastRenderedPageBreak/>
+        <w:t>Retinex</w:t>
+      </w:r>
+      <w:r>
+        <w:rPr>
+          <w:rFonts w:ascii="Times New Roman" w:eastAsia="Times New Roman" w:hAnsi="Times New Roman" w:cs="Times New Roman"/>
+          <w:kern w:val="0"/>
+          <w:sz w:val="28"/>
+          <w:szCs w:val="28"/>
+          <w14:ligatures w14:val="none"/>
+        </w:rPr>
+        <w:t xml:space="preserve"> (</w:t>
+      </w:r>
+      <w:r>
+        <w:rPr>
+          <w:rFonts w:ascii="Times New Roman" w:eastAsia="Times New Roman" w:hAnsi="Times New Roman" w:cs="Times New Roman"/>
+          <w:kern w:val="0"/>
+          <w:sz w:val="28"/>
+          <w:szCs w:val="28"/>
+          <w14:ligatures w14:val="none"/>
+        </w:rPr>
+        <w:t xml:space="preserve">Retinex theory assumes that the image we see (I) is a combination of two things: the </w:t>
+      </w:r>
+      <w:r>
+        <w:rPr>
+          <w:rFonts w:ascii="Times New Roman" w:eastAsia="Times New Roman" w:hAnsi="Times New Roman" w:cs="Times New Roman"/>
+          <w:b/>
+          <w:bCs/>
+          <w:kern w:val="0"/>
+          <w:sz w:val="28"/>
+          <w:szCs w:val="28"/>
+          <w14:ligatures w14:val="none"/>
+        </w:rPr>
+        <w:t>Reflectance</w:t>
+      </w:r>
+      <w:r>
+        <w:rPr>
+          <w:rFonts w:ascii="Times New Roman" w:eastAsia="Times New Roman" w:hAnsi="Times New Roman" w:cs="Times New Roman"/>
+          <w:kern w:val="0"/>
+          <w:sz w:val="28"/>
+          <w:szCs w:val="28"/>
+          <w14:ligatures w14:val="none"/>
+        </w:rPr>
+        <w:t xml:space="preserve"> (R) of the object (its true color/texture) and the </w:t>
+      </w:r>
+      <w:r>
+        <w:rPr>
+          <w:rFonts w:ascii="Times New Roman" w:eastAsia="Times New Roman" w:hAnsi="Times New Roman" w:cs="Times New Roman"/>
+          <w:b/>
+          <w:bCs/>
+          <w:kern w:val="0"/>
+          <w:sz w:val="28"/>
+          <w:szCs w:val="28"/>
+          <w14:ligatures w14:val="none"/>
+        </w:rPr>
+        <w:t>Illumination</w:t>
+      </w:r>
+      <w:r>
+        <w:rPr>
+          <w:rFonts w:ascii="Times New Roman" w:eastAsia="Times New Roman" w:hAnsi="Times New Roman" w:cs="Times New Roman"/>
+          <w:kern w:val="0"/>
+          <w:sz w:val="28"/>
+          <w:szCs w:val="28"/>
+          <w14:ligatures w14:val="none"/>
+        </w:rPr>
+        <w:t xml:space="preserve"> (L) of the scene (the light hitting it).</w:t>
+      </w:r>
+      <w:r>
+        <w:rPr>
+          <w:rFonts w:ascii="Times New Roman" w:eastAsia="Times New Roman" w:hAnsi="Times New Roman" w:cs="Times New Roman"/>
+          <w:kern w:val="0"/>
+          <w:sz w:val="28"/>
+          <w:szCs w:val="28"/>
+          <w14:ligatures w14:val="none"/>
+        </w:rPr>
+        <w:t xml:space="preserve"> </w:t>
+      </w:r>
+      <w:r>
+        <w:rPr>
+          <w:rFonts w:ascii="Times New Roman" w:eastAsia="Times New Roman" w:hAnsi="Times New Roman" w:cs="Times New Roman"/>
+          <w:kern w:val="0"/>
+          <w:sz w:val="28"/>
+          <w:szCs w:val="28"/>
+          <w14:ligatures w14:val="none"/>
+        </w:rPr>
+        <w:t xml:space="preserve">I(x,y) = R(x,y) </w:t>
+      </w:r>
+      <w:r>
+        <w:rPr>
+          <w:rFonts w:ascii="Times New Roman" w:eastAsia="Times New Roman" w:hAnsi="Times New Roman" w:cs="Times New Roman"/>
+          <w:kern w:val="0"/>
+          <w:sz w:val="28"/>
+          <w:szCs w:val="28"/>
+          <w14:ligatures w14:val="none"/>
+        </w:rPr>
+        <w:t>.</w:t>
+      </w:r>
+      <w:r>
+        <w:rPr>
+          <w:rFonts w:ascii="Times New Roman" w:eastAsia="Times New Roman" w:hAnsi="Times New Roman" w:cs="Times New Roman"/>
+          <w:kern w:val="0"/>
+          <w:sz w:val="28"/>
+          <w:szCs w:val="28"/>
+          <w14:ligatures w14:val="none"/>
+        </w:rPr>
+        <w:t xml:space="preserve"> L(x,y)</w:t>
+      </w:r>
+    </w:p>
+    <w:p>
+      <w:pPr>
+        <w:spacing w:before="100" w:beforeAutospacing="1" w:after="100" w:afterAutospacing="1" w:line="276" w:lineRule="auto"/>
+        <w:rPr>
+          <w:rFonts w:ascii="Times New Roman" w:eastAsia="Times New Roman" w:hAnsi="Times New Roman" w:cs="Times New Roman"/>
+          <w:kern w:val="0"/>
+          <w:sz w:val="28"/>
+          <w:szCs w:val="28"/>
+          <w14:ligatures w14:val="none"/>
+        </w:rPr>
+      </w:pPr>
+      <w:r>
+        <w:rPr>
+          <w:rFonts w:ascii="Times New Roman" w:eastAsia="Times New Roman" w:hAnsi="Times New Roman" w:cs="Times New Roman"/>
+          <w:kern w:val="0"/>
+          <w:sz w:val="28"/>
+          <w:szCs w:val="28"/>
+          <w14:ligatures w14:val="none"/>
+        </w:rPr>
+        <w:t>I</w:t>
+      </w:r>
+      <w:r>
+        <w:rPr>
+          <w:rFonts w:ascii="Times New Roman" w:eastAsia="Times New Roman" w:hAnsi="Times New Roman" w:cs="Times New Roman"/>
+          <w:kern w:val="0"/>
+          <w:sz w:val="28"/>
+          <w:szCs w:val="28"/>
+          <w14:ligatures w14:val="none"/>
+        </w:rPr>
+        <w:t>n a dark CCTV clip, $L$ is very low. We want to "divide" the illumination out to find the true $R$.</w:t>
+      </w:r>
+    </w:p>
+    <w:p>
+      <w:pPr>
+        <w:spacing w:before="100" w:beforeAutospacing="1" w:after="100" w:afterAutospacing="1" w:line="276" w:lineRule="auto"/>
+        <w:rPr>
+          <w:rFonts w:ascii="Times New Roman" w:eastAsia="Times New Roman" w:hAnsi="Times New Roman" w:cs="Times New Roman"/>
+          <w:kern w:val="0"/>
+          <w:sz w:val="28"/>
+          <w:szCs w:val="28"/>
+          <w14:ligatures w14:val="none"/>
+        </w:rPr>
+      </w:pPr>
+      <w:r>
+        <w:rPr>
+          <w:rFonts w:ascii="Times New Roman" w:eastAsia="Times New Roman" w:hAnsi="Times New Roman" w:cs="Times New Roman"/>
+          <w:kern w:val="0"/>
+          <w:sz w:val="28"/>
+          <w:szCs w:val="28"/>
+          <w14:ligatures w14:val="none"/>
+        </w:rPr>
+        <w:t xml:space="preserve">We </w:t>
+      </w:r>
+      <w:r>
+        <w:rPr>
+          <w:rFonts w:ascii="Times New Roman" w:eastAsia="Times New Roman" w:hAnsi="Times New Roman" w:cs="Times New Roman"/>
+          <w:kern w:val="0"/>
+          <w:sz w:val="28"/>
+          <w:szCs w:val="28"/>
+          <w14:ligatures w14:val="none"/>
+        </w:rPr>
+        <w:t xml:space="preserve">use </w:t>
+      </w:r>
+      <w:r>
+        <w:rPr>
+          <w:rFonts w:ascii="Times New Roman" w:eastAsia="Times New Roman" w:hAnsi="Times New Roman" w:cs="Times New Roman"/>
+          <w:b/>
+          <w:bCs/>
+          <w:kern w:val="0"/>
+          <w:sz w:val="28"/>
+          <w:szCs w:val="28"/>
+          <w14:ligatures w14:val="none"/>
+        </w:rPr>
+        <w:t>Zero-DCE</w:t>
+      </w:r>
+      <w:r>
+        <w:rPr>
+          <w:rFonts w:ascii="Times New Roman" w:eastAsia="Times New Roman" w:hAnsi="Times New Roman" w:cs="Times New Roman"/>
+          <w:kern w:val="0"/>
+          <w:sz w:val="28"/>
+          <w:szCs w:val="28"/>
+          <w14:ligatures w14:val="none"/>
+        </w:rPr>
+        <w:t xml:space="preserve"> (Zero-Reference Deep Curve Estimation). The AI adjusts the dynamic range of the matrix without needing a "bright" version of the same video for training.</w:t>
+      </w:r>
+    </w:p>
+    <w:p>
+      <w:pPr>
+        <w:spacing w:before="100" w:beforeAutospacing="1" w:after="100" w:afterAutospacing="1" w:line="276" w:lineRule="auto"/>
+        <w:rPr>
+          <w:rFonts w:ascii="Times New Roman" w:eastAsia="Times New Roman" w:hAnsi="Times New Roman" w:cs="Times New Roman"/>
+          <w:b/>
+          <w:bCs/>
+          <w:kern w:val="0"/>
+          <w:sz w:val="28"/>
+          <w:szCs w:val="28"/>
+          <w14:ligatures w14:val="none"/>
+        </w:rPr>
+      </w:pPr>
+      <w:r>
+        <w:rPr>
+          <w:rFonts w:ascii="Times New Roman" w:eastAsia="Times New Roman" w:hAnsi="Times New Roman" w:cs="Times New Roman"/>
+          <w:b/>
+          <w:bCs/>
+          <w:kern w:val="0"/>
+          <w:sz w:val="28"/>
+          <w:szCs w:val="28"/>
+          <w14:ligatures w14:val="none"/>
+        </w:rPr>
+        <w:t>Veil Removal:</w:t>
+      </w:r>
+    </w:p>
+    <w:p>
+      <w:pPr>
+        <w:spacing w:before="100" w:beforeAutospacing="1" w:after="100" w:afterAutospacing="1" w:line="276" w:lineRule="auto"/>
+        <w:rPr>
+          <w:rFonts w:ascii="Times New Roman" w:eastAsia="Times New Roman" w:hAnsi="Times New Roman" w:cs="Times New Roman"/>
+          <w:kern w:val="0"/>
+          <w:sz w:val="28"/>
+          <w:szCs w:val="28"/>
+          <w14:ligatures w14:val="none"/>
+        </w:rPr>
+      </w:pPr>
+      <w:r>
+        <w:rPr>
+          <w:rFonts w:ascii="Times New Roman" w:eastAsia="Times New Roman" w:hAnsi="Times New Roman" w:cs="Times New Roman"/>
+          <w:b/>
+          <w:bCs/>
+          <w:kern w:val="0"/>
+          <w:sz w:val="28"/>
+          <w:szCs w:val="28"/>
+          <w14:ligatures w14:val="none"/>
+        </w:rPr>
+        <w:t>The Analogy:</w:t>
+      </w:r>
+      <w:r>
+        <w:rPr>
+          <w:rFonts w:ascii="Times New Roman" w:eastAsia="Times New Roman" w:hAnsi="Times New Roman" w:cs="Times New Roman"/>
+          <w:kern w:val="0"/>
+          <w:sz w:val="28"/>
+          <w:szCs w:val="28"/>
+          <w14:ligatures w14:val="none"/>
+        </w:rPr>
+        <w:t xml:space="preserve"> Fog or dust acts like a "White Veil"</w:t>
+      </w:r>
+      <w:r>
+        <w:rPr>
+          <w:rFonts w:ascii="Times New Roman" w:eastAsia="Times New Roman" w:hAnsi="Times New Roman" w:cs="Times New Roman"/>
+          <w:kern w:val="0"/>
+          <w:sz w:val="28"/>
+          <w:szCs w:val="28"/>
+          <w14:ligatures w14:val="none"/>
+        </w:rPr>
+        <w:t>(</w:t>
+      </w:r>
+      <w:r>
+        <w:rPr>
+          <w:rFonts w:ascii="Times New Roman" w:eastAsia="Times New Roman" w:hAnsi="Times New Roman" w:cs="Times New Roman"/>
+          <w:b/>
+          <w:bCs/>
+          <w:kern w:val="0"/>
+          <w:sz w:val="28"/>
+          <w:szCs w:val="28"/>
+          <w14:ligatures w14:val="none"/>
+        </w:rPr>
+        <w:t>Atmospheric Light</w:t>
+      </w:r>
+      <w:r>
+        <w:rPr>
+          <w:rFonts w:ascii="Times New Roman" w:eastAsia="Times New Roman" w:hAnsi="Times New Roman" w:cs="Times New Roman"/>
+          <w:kern w:val="0"/>
+          <w:sz w:val="28"/>
+          <w:szCs w:val="28"/>
+          <w14:ligatures w14:val="none"/>
+        </w:rPr>
+        <w:t>)</w:t>
+      </w:r>
+      <w:r>
+        <w:rPr>
+          <w:rFonts w:ascii="Times New Roman" w:eastAsia="Times New Roman" w:hAnsi="Times New Roman" w:cs="Times New Roman"/>
+          <w:kern w:val="0"/>
+          <w:sz w:val="28"/>
+          <w:szCs w:val="28"/>
+          <w14:ligatures w14:val="none"/>
+        </w:rPr>
+        <w:t xml:space="preserve"> over the lens.</w:t>
+      </w:r>
+    </w:p>
+    <w:p>
+      <w:pPr>
+        <w:numPr>
+          <w:ilvl w:val="0"/>
+          <w:numId w:val="11"/>
+        </w:numPr>
+        <w:spacing w:before="100" w:beforeAutospacing="1" w:after="100" w:afterAutospacing="1" w:line="276" w:lineRule="auto"/>
+        <w:rPr>
+          <w:rFonts w:ascii="Times New Roman" w:eastAsia="Times New Roman" w:hAnsi="Times New Roman" w:cs="Times New Roman"/>
+          <w:kern w:val="0"/>
+          <w:sz w:val="28"/>
+          <w:szCs w:val="28"/>
+          <w14:ligatures w14:val="none"/>
+        </w:rPr>
+      </w:pPr>
+      <w:r>
+        <w:rPr>
+          <w:rFonts w:ascii="Times New Roman" w:eastAsia="Times New Roman" w:hAnsi="Times New Roman" w:cs="Times New Roman"/>
+          <w:b/>
+          <w:bCs/>
+          <w:kern w:val="0"/>
+          <w:sz w:val="28"/>
+          <w:szCs w:val="28"/>
+          <w14:ligatures w14:val="none"/>
+        </w:rPr>
+        <w:t>The Matrix Math:</w:t>
+      </w:r>
+      <w:r>
+        <w:rPr>
+          <w:rFonts w:ascii="Times New Roman" w:eastAsia="Times New Roman" w:hAnsi="Times New Roman" w:cs="Times New Roman"/>
+          <w:kern w:val="0"/>
+          <w:sz w:val="28"/>
+          <w:szCs w:val="28"/>
+          <w14:ligatures w14:val="none"/>
+        </w:rPr>
+        <w:t xml:space="preserve"> We calculate the </w:t>
+      </w:r>
+      <w:r>
+        <w:rPr>
+          <w:rFonts w:ascii="Times New Roman" w:eastAsia="Times New Roman" w:hAnsi="Times New Roman" w:cs="Times New Roman"/>
+          <w:b/>
+          <w:bCs/>
+          <w:kern w:val="0"/>
+          <w:sz w:val="28"/>
+          <w:szCs w:val="28"/>
+          <w14:ligatures w14:val="none"/>
+        </w:rPr>
+        <w:t>Dark Channel Prior</w:t>
+      </w:r>
+      <w:r>
+        <w:rPr>
+          <w:rFonts w:ascii="Times New Roman" w:eastAsia="Times New Roman" w:hAnsi="Times New Roman" w:cs="Times New Roman"/>
+          <w:kern w:val="0"/>
+          <w:sz w:val="28"/>
+          <w:szCs w:val="28"/>
+          <w14:ligatures w14:val="none"/>
+        </w:rPr>
+        <w:t>. In any clear outdoor image, at least one color channel (R, G, or B) has some pixels that are very dark. If a block of pixels is "light" across all channels, it’s likely fog/dust.</w:t>
+      </w:r>
+    </w:p>
+    <w:p>
+      <w:pPr>
+        <w:numPr>
+          <w:ilvl w:val="0"/>
+          <w:numId w:val="11"/>
+        </w:numPr>
+        <w:spacing w:before="100" w:beforeAutospacing="1" w:after="100" w:afterAutospacing="1" w:line="276" w:lineRule="auto"/>
+        <w:rPr>
+          <w:rFonts w:ascii="Times New Roman" w:eastAsia="Times New Roman" w:hAnsi="Times New Roman" w:cs="Times New Roman"/>
+          <w:kern w:val="0"/>
+          <w:sz w:val="28"/>
+          <w:szCs w:val="28"/>
+          <w14:ligatures w14:val="none"/>
+        </w:rPr>
+      </w:pPr>
+      <w:r>
+        <w:rPr>
+          <w:rFonts w:ascii="Times New Roman" w:eastAsia="Times New Roman" w:hAnsi="Times New Roman" w:cs="Times New Roman"/>
+          <w:b/>
+          <w:bCs/>
+          <w:kern w:val="0"/>
+          <w:sz w:val="28"/>
+          <w:szCs w:val="28"/>
+          <w14:ligatures w14:val="none"/>
+        </w:rPr>
+        <w:t>The Fix:</w:t>
+      </w:r>
+      <w:r>
+        <w:rPr>
+          <w:rFonts w:ascii="Times New Roman" w:eastAsia="Times New Roman" w:hAnsi="Times New Roman" w:cs="Times New Roman"/>
+          <w:kern w:val="0"/>
+          <w:sz w:val="28"/>
+          <w:szCs w:val="28"/>
+          <w14:ligatures w14:val="none"/>
+        </w:rPr>
+        <w:t xml:space="preserve"> We mathematically "subtract" the fog value from every pixel to reveal the true contrast underneath</w:t>
+      </w:r>
+    </w:p>
+    <w:p>
+      <w:pPr>
+        <w:spacing w:before="100" w:beforeAutospacing="1" w:after="100" w:afterAutospacing="1" w:line="276" w:lineRule="auto"/>
+        <w:rPr>
+          <w:rFonts w:ascii="Times New Roman" w:eastAsia="Times New Roman" w:hAnsi="Times New Roman" w:cs="Times New Roman"/>
+          <w:kern w:val="0"/>
+          <w:sz w:val="28"/>
+          <w:szCs w:val="28"/>
+          <w14:ligatures w14:val="none"/>
+        </w:rPr>
+      </w:pPr>
+      <w:r>
+        <w:rPr>
+          <w:rFonts w:ascii="Times New Roman" w:eastAsia="Times New Roman" w:hAnsi="Times New Roman" w:cs="Times New Roman"/>
+          <w:kern w:val="0"/>
+          <w:sz w:val="28"/>
+          <w:szCs w:val="28"/>
+          <w14:ligatures w14:val="none"/>
+        </w:rPr>
+        <w:t xml:space="preserve">When there is fog, smoke, or dust, a "Veil" of white light is added to every pixel. This is called </w:t>
+      </w:r>
+      <w:r>
+        <w:rPr>
+          <w:rFonts w:ascii="Times New Roman" w:eastAsia="Times New Roman" w:hAnsi="Times New Roman" w:cs="Times New Roman"/>
+          <w:b/>
+          <w:bCs/>
+          <w:kern w:val="0"/>
+          <w:sz w:val="28"/>
+          <w:szCs w:val="28"/>
+          <w14:ligatures w14:val="none"/>
+        </w:rPr>
+        <w:t>Atmospheric Light</w:t>
+      </w:r>
+      <w:r>
+        <w:rPr>
+          <w:rFonts w:ascii="Times New Roman" w:eastAsia="Times New Roman" w:hAnsi="Times New Roman" w:cs="Times New Roman"/>
+          <w:kern w:val="0"/>
+          <w:sz w:val="28"/>
+          <w:szCs w:val="28"/>
+          <w14:ligatures w14:val="none"/>
+        </w:rPr>
+        <w:t xml:space="preserve"> (A). It washes out contrast because it adds a constant high value to everything.</w:t>
+      </w:r>
+    </w:p>
+    <w:p>
+      <w:pPr>
+        <w:pStyle w:val="ListParagraph"/>
+        <w:numPr>
+          <w:ilvl w:val="0"/>
+          <w:numId w:val="11"/>
+        </w:numPr>
+        <w:spacing w:after="100" w:afterAutospacing="1" w:line="276" w:lineRule="auto"/>
+        <w:rPr>
+          <w:rFonts w:ascii="Times New Roman" w:eastAsia="Times New Roman" w:hAnsi="Times New Roman" w:cs="Times New Roman"/>
+          <w:kern w:val="0"/>
+          <w:sz w:val="28"/>
+          <w:szCs w:val="28"/>
+          <w14:ligatures w14:val="none"/>
+        </w:rPr>
+      </w:pPr>
+      <w:r>
+        <w:rPr>
+          <w:rFonts w:ascii="Times New Roman" w:eastAsia="Times New Roman" w:hAnsi="Times New Roman" w:cs="Times New Roman"/>
+          <w:kern w:val="0"/>
+          <w:sz w:val="28"/>
+          <w:szCs w:val="28"/>
+          <w14:ligatures w14:val="none"/>
+        </w:rPr>
+        <w:t>Mathematically:</w:t>
+      </w:r>
+    </w:p>
+    <w:p>
+      <w:pPr>
+        <w:pStyle w:val="ListParagraph"/>
+        <w:numPr>
+          <w:ilvl w:val="0"/>
+          <w:numId w:val="11"/>
+        </w:numPr>
+        <w:spacing w:after="0" w:line="276" w:lineRule="auto"/>
+        <w:rPr>
+          <w:rFonts w:ascii="Times New Roman" w:eastAsia="Times New Roman" w:hAnsi="Times New Roman" w:cs="Times New Roman"/>
+          <w:kern w:val="0"/>
+          <w:sz w:val="28"/>
+          <w:szCs w:val="28"/>
+          <w14:ligatures w14:val="none"/>
+        </w:rPr>
+      </w:pPr>
+      <w:r>
+        <w:rPr>
+          <w:rFonts w:ascii="Times New Roman" w:eastAsia="Times New Roman" w:hAnsi="Times New Roman" w:cs="Times New Roman"/>
+          <w:kern w:val="0"/>
+          <w:sz w:val="28"/>
+          <w:szCs w:val="28"/>
+          <w14:ligatures w14:val="none"/>
+        </w:rPr>
+        <w:t xml:space="preserve">I(x,y) = J(x,y) </w:t>
+      </w:r>
+      <w:r>
+        <w:rPr>
+          <w:rFonts w:ascii="Times New Roman" w:eastAsia="Times New Roman" w:hAnsi="Times New Roman" w:cs="Times New Roman"/>
+          <w:kern w:val="0"/>
+          <w:sz w:val="28"/>
+          <w:szCs w:val="28"/>
+          <w14:ligatures w14:val="none"/>
+        </w:rPr>
+        <w:t xml:space="preserve">. </w:t>
+      </w:r>
+      <w:r>
+        <w:rPr>
+          <w:rFonts w:ascii="Times New Roman" w:eastAsia="Times New Roman" w:hAnsi="Times New Roman" w:cs="Times New Roman"/>
+          <w:kern w:val="0"/>
+          <w:sz w:val="28"/>
+          <w:szCs w:val="28"/>
+          <w14:ligatures w14:val="none"/>
+        </w:rPr>
+        <w:t>t(x,y) + A(1 - t(x,y))</w:t>
+      </w:r>
+    </w:p>
+    <w:p>
+      <w:pPr>
+        <w:pStyle w:val="ListParagraph"/>
+        <w:numPr>
+          <w:ilvl w:val="0"/>
+          <w:numId w:val="11"/>
+        </w:numPr>
+        <w:spacing w:after="100" w:afterAutospacing="1" w:line="276" w:lineRule="auto"/>
+        <w:rPr>
+          <w:rFonts w:ascii="Times New Roman" w:eastAsia="Times New Roman" w:hAnsi="Times New Roman" w:cs="Times New Roman"/>
+          <w:kern w:val="0"/>
+          <w:sz w:val="28"/>
+          <w:szCs w:val="28"/>
+          <w14:ligatures w14:val="none"/>
+        </w:rPr>
+      </w:pPr>
+      <w:r>
+        <w:rPr>
+          <w:rFonts w:ascii="Times New Roman" w:eastAsia="Times New Roman" w:hAnsi="Times New Roman" w:cs="Times New Roman"/>
+          <w:kern w:val="0"/>
+          <w:sz w:val="28"/>
+          <w:szCs w:val="28"/>
+          <w14:ligatures w14:val="none"/>
+        </w:rPr>
+        <w:t>(Where $J$ is the clear image and t is the transmission/clarity of the air).</w:t>
+      </w:r>
+    </w:p>
+    <w:p>
+      <w:pPr>
+        <w:pStyle w:val="ListParagraph"/>
+        <w:numPr>
+          <w:ilvl w:val="0"/>
+          <w:numId w:val="11"/>
+        </w:numPr>
+        <w:spacing w:after="100" w:afterAutospacing="1" w:line="276" w:lineRule="auto"/>
+        <w:rPr>
+          <w:rFonts w:ascii="Times New Roman" w:eastAsia="Times New Roman" w:hAnsi="Times New Roman" w:cs="Times New Roman"/>
+          <w:kern w:val="0"/>
+          <w:sz w:val="28"/>
+          <w:szCs w:val="28"/>
+          <w14:ligatures w14:val="none"/>
+        </w:rPr>
+      </w:pPr>
+      <w:r>
+        <w:rPr>
+          <w:rFonts w:ascii="Times New Roman" w:eastAsia="Times New Roman" w:hAnsi="Times New Roman" w:cs="Times New Roman"/>
+          <w:b/>
+          <w:bCs/>
+          <w:kern w:val="0"/>
+          <w:sz w:val="28"/>
+          <w:szCs w:val="28"/>
+          <w14:ligatures w14:val="none"/>
+        </w:rPr>
+        <w:t>The Goal:</w:t>
+      </w:r>
+      <w:r>
+        <w:rPr>
+          <w:rFonts w:ascii="Times New Roman" w:eastAsia="Times New Roman" w:hAnsi="Times New Roman" w:cs="Times New Roman"/>
+          <w:kern w:val="0"/>
+          <w:sz w:val="28"/>
+          <w:szCs w:val="28"/>
+          <w14:ligatures w14:val="none"/>
+        </w:rPr>
+        <w:t xml:space="preserve"> Subtract the "Veil" (A) to recover the hidden contrast.</w:t>
+      </w:r>
+    </w:p>
+    <w:p>
+      <w:pPr>
+        <w:pStyle w:val="ListParagraph"/>
+        <w:numPr>
+          <w:ilvl w:val="0"/>
+          <w:numId w:val="11"/>
+        </w:numPr>
+        <w:spacing w:after="100" w:afterAutospacing="1" w:line="276" w:lineRule="auto"/>
+        <w:outlineLvl w:val="2"/>
+        <w:rPr>
+          <w:rFonts w:ascii="Times New Roman" w:eastAsia="Times New Roman" w:hAnsi="Times New Roman" w:cs="Times New Roman"/>
+          <w:b/>
+          <w:bCs/>
+          <w:kern w:val="0"/>
+          <w:sz w:val="28"/>
+          <w:szCs w:val="28"/>
+          <w14:ligatures w14:val="none"/>
+        </w:rPr>
+      </w:pPr>
+      <w:r>
+        <w:rPr>
+          <w:rFonts w:ascii="Times New Roman" w:eastAsia="Times New Roman" w:hAnsi="Times New Roman" w:cs="Times New Roman"/>
+          <w:b/>
+          <w:bCs/>
+          <w:kern w:val="0"/>
+          <w:sz w:val="28"/>
+          <w:szCs w:val="28"/>
+          <w14:ligatures w14:val="none"/>
+        </w:rPr>
+        <w:t>Matrix Example (License plate in fog)</w:t>
+      </w:r>
+    </w:p>
+    <w:p>
+      <w:pPr>
+        <w:pStyle w:val="ListParagraph"/>
+        <w:numPr>
+          <w:ilvl w:val="0"/>
+          <w:numId w:val="11"/>
+        </w:numPr>
+        <w:spacing w:after="100" w:afterAutospacing="1" w:line="276" w:lineRule="auto"/>
+        <w:rPr>
+          <w:rFonts w:ascii="Times New Roman" w:eastAsia="Times New Roman" w:hAnsi="Times New Roman" w:cs="Times New Roman"/>
+          <w:kern w:val="0"/>
+          <w:sz w:val="28"/>
+          <w:szCs w:val="28"/>
+          <w14:ligatures w14:val="none"/>
+        </w:rPr>
+      </w:pPr>
+      <w:r>
+        <w:rPr>
+          <w:rFonts w:ascii="Times New Roman" w:eastAsia="Times New Roman" w:hAnsi="Times New Roman" w:cs="Times New Roman"/>
+          <w:kern w:val="0"/>
+          <w:sz w:val="28"/>
+          <w:szCs w:val="28"/>
+          <w14:ligatures w14:val="none"/>
+        </w:rPr>
+        <w:t>Imagine a license plate where the letters are dark (20) and the plate is light (150). Fog adds a "Veil" of +100 to every pixel.</w:t>
+      </w:r>
+    </w:p>
+    <w:p>
+      <w:pPr>
+        <w:spacing w:before="100" w:beforeAutospacing="1" w:after="100" w:afterAutospacing="1" w:line="276" w:lineRule="auto"/>
+        <w:rPr>
+          <w:rFonts w:ascii="Times New Roman" w:eastAsia="Times New Roman" w:hAnsi="Times New Roman" w:cs="Times New Roman"/>
+          <w:kern w:val="0"/>
+          <w:sz w:val="28"/>
+          <w:szCs w:val="28"/>
+          <w14:ligatures w14:val="none"/>
+        </w:rPr>
+      </w:pPr>
+    </w:p>
+    <w:p>
+      <w:pPr>
+        <w:spacing w:before="100" w:beforeAutospacing="1" w:after="100" w:afterAutospacing="1" w:line="276" w:lineRule="auto"/>
+        <w:rPr>
+          <w:rFonts w:ascii="Times New Roman" w:eastAsia="Times New Roman" w:hAnsi="Times New Roman" w:cs="Times New Roman"/>
+          <w:b/>
+          <w:bCs/>
+          <w:kern w:val="0"/>
+          <w:sz w:val="28"/>
+          <w:szCs w:val="28"/>
+          <w14:ligatures w14:val="none"/>
+        </w:rPr>
+      </w:pPr>
+      <w:r>
+        <w:rPr>
+          <w:rFonts w:ascii="Times New Roman" w:eastAsia="Times New Roman" w:hAnsi="Times New Roman" w:cs="Times New Roman"/>
+          <w:kern w:val="0"/>
+          <w:sz w:val="28"/>
+          <w:szCs w:val="28"/>
+          <w14:ligatures w14:val="none"/>
+        </w:rPr>
+        <w:lastRenderedPageBreak/>
+        <w:t xml:space="preserve">3. </w:t>
+      </w:r>
+      <w:r>
+        <w:rPr>
+          <w:rFonts w:ascii="Times New Roman" w:eastAsia="Times New Roman" w:hAnsi="Times New Roman" w:cs="Times New Roman"/>
+          <w:b/>
+          <w:bCs/>
+          <w:kern w:val="0"/>
+          <w:sz w:val="28"/>
+          <w:szCs w:val="28"/>
+          <w14:ligatures w14:val="none"/>
+        </w:rPr>
+        <w:t>Denoising</w:t>
+      </w:r>
+    </w:p>
+    <w:p>
+      <w:pPr>
+        <w:spacing w:before="100" w:beforeAutospacing="1" w:after="100" w:afterAutospacing="1" w:line="276" w:lineRule="auto"/>
+        <w:rPr>
+          <w:rFonts w:ascii="Times New Roman" w:eastAsia="Times New Roman" w:hAnsi="Times New Roman" w:cs="Times New Roman"/>
+          <w:b/>
+          <w:bCs/>
+          <w:kern w:val="0"/>
+          <w:sz w:val="28"/>
+          <w:szCs w:val="28"/>
+          <w14:ligatures w14:val="none"/>
+        </w:rPr>
+      </w:pPr>
+      <w:r>
+        <w:rPr>
+          <w:rFonts w:ascii="Times New Roman" w:eastAsia="Times New Roman" w:hAnsi="Times New Roman" w:cs="Times New Roman"/>
+          <w:kern w:val="0"/>
+          <w:sz w:val="28"/>
+          <w:szCs w:val="28"/>
+          <w14:ligatures w14:val="none"/>
+        </w:rPr>
+        <w:t xml:space="preserve">4. </w:t>
+      </w:r>
+      <w:r>
+        <w:rPr>
+          <w:rFonts w:ascii="Times New Roman" w:eastAsia="Times New Roman" w:hAnsi="Times New Roman" w:cs="Times New Roman"/>
+          <w:b/>
+          <w:bCs/>
+          <w:kern w:val="0"/>
+          <w:sz w:val="28"/>
+          <w:szCs w:val="28"/>
+          <w14:ligatures w14:val="none"/>
+        </w:rPr>
+        <w:t>VSR Module</w:t>
+      </w:r>
+    </w:p>
+    <w:p>
+      <w:pPr>
+        <w:spacing w:before="100" w:beforeAutospacing="1" w:after="100" w:afterAutospacing="1" w:line="276" w:lineRule="auto"/>
+        <w:rPr>
+          <w:rFonts w:ascii="Times New Roman" w:eastAsia="Times New Roman" w:hAnsi="Times New Roman" w:cs="Times New Roman"/>
+          <w:b/>
+          <w:bCs/>
+          <w:kern w:val="0"/>
+          <w:sz w:val="28"/>
+          <w:szCs w:val="28"/>
+          <w14:ligatures w14:val="none"/>
+        </w:rPr>
+      </w:pPr>
+      <w:r>
+        <w:rPr>
+          <w:rFonts w:ascii="Times New Roman" w:eastAsia="Times New Roman" w:hAnsi="Times New Roman" w:cs="Times New Roman"/>
+          <w:kern w:val="0"/>
+          <w:sz w:val="28"/>
+          <w:szCs w:val="28"/>
+          <w14:ligatures w14:val="none"/>
+        </w:rPr>
+        <w:t xml:space="preserve">5. </w:t>
+      </w:r>
+      <w:r>
+        <w:rPr>
+          <w:rFonts w:ascii="Times New Roman" w:eastAsia="Times New Roman" w:hAnsi="Times New Roman" w:cs="Times New Roman"/>
+          <w:b/>
+          <w:bCs/>
+          <w:kern w:val="0"/>
+          <w:sz w:val="28"/>
+          <w:szCs w:val="28"/>
+          <w14:ligatures w14:val="none"/>
+        </w:rPr>
+        <w:t>Sharpening</w:t>
+      </w:r>
+    </w:p>
+    <w:p>
+      <w:pPr>
+        <w:spacing w:before="100" w:beforeAutospacing="1" w:after="100" w:afterAutospacing="1" w:line="276" w:lineRule="auto"/>
+        <w:rPr>
+          <w:rFonts w:ascii="Times New Roman" w:eastAsia="Times New Roman" w:hAnsi="Times New Roman" w:cs="Times New Roman"/>
+          <w:kern w:val="0"/>
+          <w:sz w:val="28"/>
+          <w:szCs w:val="28"/>
           <w14:ligatures w14:val="none"/>
         </w:rPr>
       </w:pPr>
@@ -2994,6 +4241,155 @@
     </w:lvl>
   </w:abstractNum>
   <w:abstractNum w:abstractNumId="1" w15:restartNumberingAfterBreak="0">
+    <w:nsid w:val="0CED0044"/>
+    <w:multiLevelType w:val="multilevel"/>
+    <w:tmpl w:val="C8A4BAD6"/>
+    <w:lvl w:ilvl="0">
+      <w:start w:val="1"/>
+      <w:numFmt w:val="bullet"/>
+      <w:lvlText w:val=""/>
+      <w:lvlJc w:val="left"/>
+      <w:pPr>
+        <w:tabs>
+          <w:tab w:val="num" w:pos="720"/>
+        </w:tabs>
+        <w:ind w:left="720" w:hanging="360"/>
+      </w:pPr>
+      <w:rPr>
+        <w:rFonts w:ascii="Symbol" w:hAnsi="Symbol" w:hint="default"/>
+        <w:sz w:val="20"/>
+      </w:rPr>
+    </w:lvl>
+    <w:lvl w:ilvl="1" w:tentative="1">
+      <w:start w:val="1"/>
+      <w:numFmt w:val="bullet"/>
+      <w:lvlText w:val="o"/>
+      <w:lvlJc w:val="left"/>
+      <w:pPr>
+        <w:tabs>
+          <w:tab w:val="num" w:pos="1440"/>
+        </w:tabs>
+        <w:ind w:left="1440" w:hanging="360"/>
+      </w:pPr>
+      <w:rPr>
+        <w:rFonts w:ascii="Courier New" w:hAnsi="Courier New" w:hint="default"/>
+        <w:sz w:val="20"/>
+      </w:rPr>
+    </w:lvl>
+    <w:lvl w:ilvl="2" w:tentative="1">
+      <w:start w:val="1"/>
+      <w:numFmt w:val="bullet"/>
+      <w:lvlText w:val=""/>
+      <w:lvlJc w:val="left"/>
+      <w:pPr>
+        <w:tabs>
+          <w:tab w:val="num" w:pos="2160"/>
+        </w:tabs>
+        <w:ind w:left="2160" w:hanging="360"/>
+      </w:pPr>
+      <w:rPr>
+        <w:rFonts w:ascii="Wingdings" w:hAnsi="Wingdings" w:hint="default"/>
+        <w:sz w:val="20"/>
+      </w:rPr>
+    </w:lvl>
+    <w:lvl w:ilvl="3" w:tentative="1">
+      <w:start w:val="1"/>
+      <w:numFmt w:val="bullet"/>
+      <w:lvlText w:val=""/>
+      <w:lvlJc w:val="left"/>
+      <w:pPr>
+        <w:tabs>
+          <w:tab w:val="num" w:pos="2880"/>
+        </w:tabs>
+        <w:ind w:left="2880" w:hanging="360"/>
+      </w:pPr>
+      <w:rPr>
+        <w:rFonts w:ascii="Wingdings" w:hAnsi="Wingdings" w:hint="default"/>
+        <w:sz w:val="20"/>
+      </w:rPr>
+    </w:lvl>
+    <w:lvl w:ilvl="4" w:tentative="1">
+      <w:start w:val="1"/>
+      <w:numFmt w:val="bullet"/>
+      <w:lvlText w:val=""/>
+      <w:lvlJc w:val="left"/>
+      <w:pPr>
+        <w:tabs>
+          <w:tab w:val="num" w:pos="3600"/>
+        </w:tabs>
+        <w:ind w:left="3600" w:hanging="360"/>
+      </w:pPr>
+      <w:rPr>
+        <w:rFonts w:ascii="Wingdings" w:hAnsi="Wingdings" w:hint="default"/>
+        <w:sz w:val="20"/>
+      </w:rPr>
+    </w:lvl>
+    <w:lvl w:ilvl="5" w:tentative="1">
+      <w:start w:val="1"/>
+      <w:numFmt w:val="bullet"/>
+      <w:lvlText w:val=""/>
+      <w:lvlJc w:val="left"/>
+      <w:pPr>
+        <w:tabs>
+          <w:tab w:val="num" w:pos="4320"/>
+        </w:tabs>
+        <w:ind w:left="4320" w:hanging="360"/>
+      </w:pPr>
+      <w:rPr>
+        <w:rFonts w:ascii="Wingdings" w:hAnsi="Wingdings" w:hint="default"/>
+        <w:sz w:val="20"/>
+      </w:rPr>
+    </w:lvl>
+    <w:lvl w:ilvl="6" w:tentative="1">
+      <w:start w:val="1"/>
+      <w:numFmt w:val="bullet"/>
+      <w:lvlText w:val=""/>
+      <w:lvlJc w:val="left"/>
+      <w:pPr>
+        <w:tabs>
+          <w:tab w:val="num" w:pos="5040"/>
+        </w:tabs>
+        <w:ind w:left="5040" w:hanging="360"/>
+      </w:pPr>
+      <w:rPr>
+        <w:rFonts w:ascii="Wingdings" w:hAnsi="Wingdings" w:hint="default"/>
+        <w:sz w:val="20"/>
+      </w:rPr>
+    </w:lvl>
+    <w:lvl w:ilvl="7" w:tentative="1">
+      <w:start w:val="1"/>
+      <w:numFmt w:val="bullet"/>
+      <w:lvlText w:val=""/>
+      <w:lvlJc w:val="left"/>
+      <w:pPr>
+        <w:tabs>
+          <w:tab w:val="num" w:pos="5760"/>
+        </w:tabs>
+        <w:ind w:left="5760" w:hanging="360"/>
+      </w:pPr>
+      <w:rPr>
+        <w:rFonts w:ascii="Wingdings" w:hAnsi="Wingdings" w:hint="default"/>
+        <w:sz w:val="20"/>
+      </w:rPr>
+    </w:lvl>
+    <w:lvl w:ilvl="8" w:tentative="1">
+      <w:start w:val="1"/>
+      <w:numFmt w:val="bullet"/>
+      <w:lvlText w:val=""/>
+      <w:lvlJc w:val="left"/>
+      <w:pPr>
+        <w:tabs>
+          <w:tab w:val="num" w:pos="6480"/>
+        </w:tabs>
+        <w:ind w:left="6480" w:hanging="360"/>
+      </w:pPr>
+      <w:rPr>
+        <w:rFonts w:ascii="Wingdings" w:hAnsi="Wingdings" w:hint="default"/>
+        <w:sz w:val="20"/>
+      </w:rPr>
+    </w:lvl>
+  </w:abstractNum>
+  <w:abstractNum w:abstractNumId="2" w15:restartNumberingAfterBreak="0">
     <w:nsid w:val="13140D7B"/>
     <w:multiLevelType w:val="multilevel"/>
     <w:tmpl w:val="ADB0A566"/>
@@ -3142,7 +4538,7 @@
       </w:rPr>
     </w:lvl>
   </w:abstractNum>
-  <w:abstractNum w:abstractNumId="2" w15:restartNumberingAfterBreak="0">
+  <w:abstractNum w:abstractNumId="3" w15:restartNumberingAfterBreak="0">
     <w:nsid w:val="145A7EC2"/>
     <w:multiLevelType w:val="multilevel"/>
     <w:tmpl w:val="63E81488"/>
@@ -3291,7 +4687,7 @@
       </w:rPr>
     </w:lvl>
   </w:abstractNum>
-  <w:abstractNum w:abstractNumId="3" w15:restartNumberingAfterBreak="0">
+  <w:abstractNum w:abstractNumId="4" w15:restartNumberingAfterBreak="0">
     <w:nsid w:val="1B095C29"/>
     <w:multiLevelType w:val="multilevel"/>
     <w:tmpl w:val="B76ADA0E"/>
@@ -3440,7 +4836,7 @@
       </w:rPr>
     </w:lvl>
   </w:abstractNum>
-  <w:abstractNum w:abstractNumId="4" w15:restartNumberingAfterBreak="0">
+  <w:abstractNum w:abstractNumId="5" w15:restartNumberingAfterBreak="0">
     <w:nsid w:val="1DC955B3"/>
     <w:multiLevelType w:val="multilevel"/>
     <w:tmpl w:val="D2A47FE2"/>
@@ -3553,7 +4949,7 @@
       </w:pPr>
     </w:lvl>
   </w:abstractNum>
-  <w:abstractNum w:abstractNumId="5" w15:restartNumberingAfterBreak="0">
+  <w:abstractNum w:abstractNumId="6" w15:restartNumberingAfterBreak="0">
     <w:nsid w:val="253B74A4"/>
     <w:multiLevelType w:val="multilevel"/>
     <w:tmpl w:val="3168C04A"/>
@@ -3702,7 +5098,7 @@
       </w:rPr>
     </w:lvl>
   </w:abstractNum>
-  <w:abstractNum w:abstractNumId="6" w15:restartNumberingAfterBreak="0">
+  <w:abstractNum w:abstractNumId="7" w15:restartNumberingAfterBreak="0">
     <w:nsid w:val="269149AD"/>
     <w:multiLevelType w:val="multilevel"/>
     <w:tmpl w:val="61242BAE"/>
@@ -3851,7 +5247,7 @@
       </w:rPr>
     </w:lvl>
   </w:abstractNum>
-  <w:abstractNum w:abstractNumId="7" w15:restartNumberingAfterBreak="0">
+  <w:abstractNum w:abstractNumId="8" w15:restartNumberingAfterBreak="0">
     <w:nsid w:val="42C82D0E"/>
     <w:multiLevelType w:val="multilevel"/>
     <w:tmpl w:val="7D988DEA"/>
@@ -3964,7 +5360,7 @@
       </w:pPr>
     </w:lvl>
   </w:abstractNum>
-  <w:abstractNum w:abstractNumId="8" w15:restartNumberingAfterBreak="0">
+  <w:abstractNum w:abstractNumId="9" w15:restartNumberingAfterBreak="0">
     <w:nsid w:val="504F275C"/>
     <w:multiLevelType w:val="multilevel"/>
     <w:tmpl w:val="774C0DAA"/>
@@ -4113,32 +5509,187 @@
       </w:rPr>
     </w:lvl>
   </w:abstractNum>
+  <w:abstractNum w:abstractNumId="10" w15:restartNumberingAfterBreak="0">
+    <w:nsid w:val="574F3D45"/>
+    <w:multiLevelType w:val="multilevel"/>
+    <w:tmpl w:val="9D9255DE"/>
+    <w:lvl w:ilvl="0">
+      <w:start w:val="1"/>
+      <w:numFmt w:val="bullet"/>
+      <w:lvlText w:val=""/>
+      <w:lvlJc w:val="left"/>
+      <w:pPr>
+        <w:tabs>
+          <w:tab w:val="num" w:pos="720"/>
+        </w:tabs>
+        <w:ind w:left="720" w:hanging="360"/>
+      </w:pPr>
+      <w:rPr>
+        <w:rFonts w:ascii="Symbol" w:hAnsi="Symbol" w:hint="default"/>
+        <w:sz w:val="20"/>
+      </w:rPr>
+    </w:lvl>
+    <w:lvl w:ilvl="1" w:tentative="1">
+      <w:start w:val="1"/>
+      <w:numFmt w:val="bullet"/>
+      <w:lvlText w:val="o"/>
+      <w:lvlJc w:val="left"/>
+      <w:pPr>
+        <w:tabs>
+          <w:tab w:val="num" w:pos="1440"/>
+        </w:tabs>
+        <w:ind w:left="1440" w:hanging="360"/>
+      </w:pPr>
+      <w:rPr>
+        <w:rFonts w:ascii="Courier New" w:hAnsi="Courier New" w:hint="default"/>
+        <w:sz w:val="20"/>
+      </w:rPr>
+    </w:lvl>
+    <w:lvl w:ilvl="2" w:tentative="1">
+      <w:start w:val="1"/>
+      <w:numFmt w:val="bullet"/>
+      <w:lvlText w:val=""/>
+      <w:lvlJc w:val="left"/>
+      <w:pPr>
+        <w:tabs>
+          <w:tab w:val="num" w:pos="2160"/>
+        </w:tabs>
+        <w:ind w:left="2160" w:hanging="360"/>
+      </w:pPr>
+      <w:rPr>
+        <w:rFonts w:ascii="Wingdings" w:hAnsi="Wingdings" w:hint="default"/>
+        <w:sz w:val="20"/>
+      </w:rPr>
+    </w:lvl>
+    <w:lvl w:ilvl="3" w:tentative="1">
+      <w:start w:val="1"/>
+      <w:numFmt w:val="bullet"/>
+      <w:lvlText w:val=""/>
+      <w:lvlJc w:val="left"/>
+      <w:pPr>
+        <w:tabs>
+          <w:tab w:val="num" w:pos="2880"/>
+        </w:tabs>
+        <w:ind w:left="2880" w:hanging="360"/>
+      </w:pPr>
+      <w:rPr>
+        <w:rFonts w:ascii="Wingdings" w:hAnsi="Wingdings" w:hint="default"/>
+        <w:sz w:val="20"/>
+      </w:rPr>
+    </w:lvl>
+    <w:lvl w:ilvl="4" w:tentative="1">
+      <w:start w:val="1"/>
+      <w:numFmt w:val="bullet"/>
+      <w:lvlText w:val=""/>
+      <w:lvlJc w:val="left"/>
+      <w:pPr>
+        <w:tabs>
+          <w:tab w:val="num" w:pos="3600"/>
+        </w:tabs>
+        <w:ind w:left="3600" w:hanging="360"/>
+      </w:pPr>
+      <w:rPr>
+        <w:rFonts w:ascii="Wingdings" w:hAnsi="Wingdings" w:hint="default"/>
+        <w:sz w:val="20"/>
+      </w:rPr>
+    </w:lvl>
+    <w:lvl w:ilvl="5" w:tentative="1">
+      <w:start w:val="1"/>
+      <w:numFmt w:val="bullet"/>
+      <w:lvlText w:val=""/>
+      <w:lvlJc w:val="left"/>
+      <w:pPr>
+        <w:tabs>
+          <w:tab w:val="num" w:pos="4320"/>
+        </w:tabs>
+        <w:ind w:left="4320" w:hanging="360"/>
+      </w:pPr>
+      <w:rPr>
+        <w:rFonts w:ascii="Wingdings" w:hAnsi="Wingdings" w:hint="default"/>
+        <w:sz w:val="20"/>
+      </w:rPr>
+    </w:lvl>
+    <w:lvl w:ilvl="6" w:tentative="1">
+      <w:start w:val="1"/>
+      <w:numFmt w:val="bullet"/>
+      <w:lvlText w:val=""/>
+      <w:lvlJc w:val="left"/>
+      <w:pPr>
+        <w:tabs>
+          <w:tab w:val="num" w:pos="5040"/>
+        </w:tabs>
+        <w:ind w:left="5040" w:hanging="360"/>
+      </w:pPr>
+      <w:rPr>
+        <w:rFonts w:ascii="Wingdings" w:hAnsi="Wingdings" w:hint="default"/>
+        <w:sz w:val="20"/>
+      </w:rPr>
+    </w:lvl>
+    <w:lvl w:ilvl="7" w:tentative="1">
+      <w:start w:val="1"/>
+      <w:numFmt w:val="bullet"/>
+      <w:lvlText w:val=""/>
+      <w:lvlJc w:val="left"/>
+      <w:pPr>
+        <w:tabs>
+          <w:tab w:val="num" w:pos="5760"/>
+        </w:tabs>
+        <w:ind w:left="5760" w:hanging="360"/>
+      </w:pPr>
+      <w:rPr>
+        <w:rFonts w:ascii="Wingdings" w:hAnsi="Wingdings" w:hint="default"/>
+        <w:sz w:val="20"/>
+      </w:rPr>
+    </w:lvl>
+    <w:lvl w:ilvl="8" w:tentative="1">
+      <w:start w:val="1"/>
+      <w:numFmt w:val="bullet"/>
+      <w:lvlText w:val=""/>
+      <w:lvlJc w:val="left"/>
+      <w:pPr>
+        <w:tabs>
+          <w:tab w:val="num" w:pos="6480"/>
+        </w:tabs>
+        <w:ind w:left="6480" w:hanging="360"/>
+      </w:pPr>
+      <w:rPr>
+        <w:rFonts w:ascii="Wingdings" w:hAnsi="Wingdings" w:hint="default"/>
+        <w:sz w:val="20"/>
+      </w:rPr>
+    </w:lvl>
+  </w:abstractNum>
   <w:num w:numId="1" w16cid:durableId="1730153376">
+    <w:abstractNumId w:val="8"/>
+  </w:num>
+  <w:num w:numId="2" w16cid:durableId="988945855">
+    <w:abstractNumId w:val="5"/>
+  </w:num>
+  <w:num w:numId="3" w16cid:durableId="379868100">
+    <w:abstractNumId w:val="3"/>
+  </w:num>
+  <w:num w:numId="4" w16cid:durableId="2074353495">
     <w:abstractNumId w:val="7"/>
   </w:num>
-  <w:num w:numId="2" w16cid:durableId="988945855">
-    <w:abstractNumId w:val="4"/>
+  <w:num w:numId="5" w16cid:durableId="653796763">
+    <w:abstractNumId w:val="6"/>
   </w:num>
-  <w:num w:numId="3" w16cid:durableId="379868100">
+  <w:num w:numId="6" w16cid:durableId="1803842753">
     <w:abstractNumId w:val="2"/>
   </w:num>
-  <w:num w:numId="4" w16cid:durableId="2074353495">
-    <w:abstractNumId w:val="6"/>
-  </w:num>
-  <w:num w:numId="5" w16cid:durableId="653796763">
-    <w:abstractNumId w:val="5"/>
-  </w:num>
-  <w:num w:numId="6" w16cid:durableId="1803842753">
-    <w:abstractNumId w:val="1"/>
-  </w:num>
   <w:num w:numId="7" w16cid:durableId="1314405255">
-    <w:abstractNumId w:val="8"/>
+    <w:abstractNumId w:val="9"/>
   </w:num>
   <w:num w:numId="8" w16cid:durableId="1632441723">
     <w:abstractNumId w:val="0"/>
   </w:num>
   <w:num w:numId="9" w16cid:durableId="1649745779">
-    <w:abstractNumId w:val="3"/>
+    <w:abstractNumId w:val="4"/>
+  </w:num>
+  <w:num w:numId="10" w16cid:durableId="521432648">
+    <w:abstractNumId w:val="1"/>
+  </w:num>
+  <w:num w:numId="11" w16cid:durableId="1599217706">
+    <w:abstractNumId w:val="10"/>
   </w:num>
 </w:numbering>
 </file>
@@ -5068,6 +6619,11 @@
       <w:rFonts w:ascii="Times New Roman" w:hAnsi="Times New Roman" w:cs="Times New Roman"/>
     </w:rPr>
   </w:style>
+  <w:style w:type="character" w:customStyle="1" w:styleId="math-inline">
+    <w:name w:val="math-inline"/>
+    <w:basedOn w:val="DefaultParagraphFont"/>
+    <w:rsid w:val="00E83635"/>
+  </w:style>
 </w:styles>
 </file>
 

</xml_diff>